<commit_message>
Update investor content for 2026-07-20
</commit_message>
<xml_diff>
--- a/public/investor-downloads/daily-brief-2026-07-20.docx
+++ b/public/investor-downloads/daily-brief-2026-07-20.docx
@@ -72,7 +72,7 @@
           <w:color w:val="334155"/>
           <w:sz w:val="22"/>
         </w:rPr>
-        <w:t>2026-07-20 共纳入 69 篇中文研究结果，覆盖 0 位活跃分析师和 5 条主要行业链，较 2026-07-19 的主题变化可在右侧动量表中核对。简报优先呈现可被报告链接追溯的结论，而不是孤立摘要。</w:t>
+        <w:t>2026-07-20 共纳入 295 篇中文研究结果，覆盖 0 位活跃分析师和 6 条主要行业链，较 2026-07-19 的主题变化可在右侧动量表中核对。简报优先呈现可被报告链接追溯的结论，而不是孤立摘要。</w:t>
       </w:r>
     </w:p>
     <w:tbl>
@@ -116,7 +116,7 @@
                 <w:color w:val="285B9D"/>
                 <w:sz w:val="36"/>
               </w:rPr>
-              <w:t>69</w:t>
+              <w:t>295</w:t>
             </w:r>
           </w:p>
         </w:tc>
@@ -178,7 +178,7 @@
                 <w:color w:val="A8731B"/>
                 <w:sz w:val="36"/>
               </w:rPr>
-              <w:t>5</w:t>
+              <w:t>6</w:t>
             </w:r>
           </w:p>
         </w:tc>
@@ -306,7 +306,7 @@
             <w:u w:val="single"/>
             <w:rFonts w:eastAsia="Arial Unicode MS" w:ascii="Calibri" w:hAnsi="Calibri"/>
           </w:rPr>
-          <w:t>2026-07-20 — 美国更高终端利率与全球电网设备短缺对中国的双向传导：人民币约束、政策空间与A股... 是今日最高权重结论，核心证据来自 未识别，关联 宏观通胀传导。</w:t>
+          <w:t>策略工作日期 2026-07-20 是今日最高权重结论，核心证据来自 未识别，关联 电力与电网。</w:t>
         </w:r>
       </w:hyperlink>
     </w:p>
@@ -330,7 +330,7 @@
           <w:color w:val="111827"/>
           <w:sz w:val="21"/>
         </w:rPr>
-        <w:t>通胀 今日 降温，当日计数 58，前一日计数 268。</w:t>
+        <w:t>能源 今日 降温，当日计数 137，前一日计数 175。</w:t>
       </w:r>
     </w:p>
     <w:p>
@@ -379,7 +379,7 @@
             <w:u w:val="single"/>
             <w:rFonts w:eastAsia="Arial Unicode MS" w:ascii="Calibri" w:hAnsi="Calibri"/>
           </w:rPr>
-          <w:t>宏观通胀传导 今日 60 条、近七日 1635 条，风险信号 1064 条。</w:t>
+          <w:t>宏观通胀传导 今日 271 条、近七日 1860 条，风险信号 1201 条。</w:t>
         </w:r>
       </w:hyperlink>
     </w:p>
@@ -693,7 +693,147 @@
           <w:color w:val="0B2545"/>
           <w:sz w:val="23"/>
         </w:rPr>
-        <w:t>1. 2026-07-20 — 美国更高终端利率与全球电网设备短缺对中国的双向传导：人民币约束、政策空间与A股...</w:t>
+        <w:t>1. 策略工作日期 2026-07-20</w:t>
+      </w:r>
+    </w:p>
+    <w:p>
+      <w:pPr>
+        <w:spacing w:before="0" w:after="40" w:line="264" w:lineRule="auto"/>
+      </w:pPr>
+      <w:r>
+        <w:rPr>
+          <w:rFonts w:ascii="Calibri" w:hAnsi="Calibri" w:eastAsia="Arial Unicode MS"/>
+          <w:b w:val="0"/>
+          <w:i w:val="0"/>
+          <w:color w:val="667085"/>
+          <w:sz w:val="17"/>
+        </w:rPr>
+        <w:t>未识别 · 电力与电网 · score 52.0</w:t>
+      </w:r>
+    </w:p>
+    <w:p>
+      <w:pPr>
+        <w:spacing w:before="0" w:after="100" w:line="264" w:lineRule="auto"/>
+      </w:pPr>
+      <w:r>
+        <w:rPr>
+          <w:rFonts w:ascii="Calibri" w:hAnsi="Calibri" w:eastAsia="Arial Unicode MS"/>
+          <w:b w:val="0"/>
+          <w:i w:val="0"/>
+          <w:color w:val="334155"/>
+          <w:sz w:val="20"/>
+        </w:rPr>
+        <w:t>所选分析师： global-macro 所选主题：AI电力与电网瓶颈对中国高硬科技与电网设备链的出口拉动与宏观传导 研究问题：当全球电网设备面临1.4万亿美元的设备通胀型Capex周期与长并网等待时，中国...</w:t>
+      </w:r>
+    </w:p>
+    <w:p>
+      <w:pPr>
+        <w:spacing w:before="0" w:after="160" w:line="264" w:lineRule="auto"/>
+      </w:pPr>
+      <w:r>
+        <w:rPr>
+          <w:rFonts w:ascii="Calibri" w:hAnsi="Calibri" w:eastAsia="Arial Unicode MS"/>
+          <w:b w:val="0"/>
+          <w:i w:val="0"/>
+          <w:color w:val="667085"/>
+          <w:sz w:val="17"/>
+        </w:rPr>
+        <w:t xml:space="preserve">Report: </w:t>
+      </w:r>
+      <w:hyperlink r:id="rId12">
+        <w:r>
+          <w:rPr>
+            <w:color w:val="285B9D"/>
+            <w:u w:val="single"/>
+            <w:rFonts w:eastAsia="Arial Unicode MS" w:ascii="Calibri" w:hAnsi="Calibri"/>
+          </w:rPr>
+          <w:t>reports/archive-aacf648641e0</w:t>
+        </w:r>
+      </w:hyperlink>
+    </w:p>
+    <w:p>
+      <w:pPr>
+        <w:spacing w:before="0" w:after="40" w:line="264" w:lineRule="auto"/>
+      </w:pPr>
+      <w:r>
+        <w:rPr>
+          <w:rFonts w:ascii="Calibri" w:hAnsi="Calibri" w:eastAsia="Arial Unicode MS"/>
+          <w:b/>
+          <w:i w:val="0"/>
+          <w:color w:val="0B2545"/>
+          <w:sz w:val="23"/>
+        </w:rPr>
+        <w:t>2. AI基础设施工作日期 2026-07-20</w:t>
+      </w:r>
+    </w:p>
+    <w:p>
+      <w:pPr>
+        <w:spacing w:before="0" w:after="40" w:line="264" w:lineRule="auto"/>
+      </w:pPr>
+      <w:r>
+        <w:rPr>
+          <w:rFonts w:ascii="Calibri" w:hAnsi="Calibri" w:eastAsia="Arial Unicode MS"/>
+          <w:b w:val="0"/>
+          <w:i w:val="0"/>
+          <w:color w:val="667085"/>
+          <w:sz w:val="17"/>
+        </w:rPr>
+        <w:t>未识别 · AI 基础设施 · score 50.5</w:t>
+      </w:r>
+    </w:p>
+    <w:p>
+      <w:pPr>
+        <w:spacing w:before="0" w:after="100" w:line="264" w:lineRule="auto"/>
+      </w:pPr>
+      <w:r>
+        <w:rPr>
+          <w:rFonts w:ascii="Calibri" w:hAnsi="Calibri" w:eastAsia="Arial Unicode MS"/>
+          <w:b w:val="0"/>
+          <w:i w:val="0"/>
+          <w:color w:val="334155"/>
+          <w:sz w:val="20"/>
+        </w:rPr>
+        <w:t>所选分析师： ai-infrastructure-analyst 所选主题：AI数据中心电力瓶颈与算力增长重估 研究问题：电力接入是否已经成为美国AI基础设施扩张的关键约束？</w:t>
+      </w:r>
+    </w:p>
+    <w:p>
+      <w:pPr>
+        <w:spacing w:before="0" w:after="160" w:line="264" w:lineRule="auto"/>
+      </w:pPr>
+      <w:r>
+        <w:rPr>
+          <w:rFonts w:ascii="Calibri" w:hAnsi="Calibri" w:eastAsia="Arial Unicode MS"/>
+          <w:b w:val="0"/>
+          <w:i w:val="0"/>
+          <w:color w:val="667085"/>
+          <w:sz w:val="17"/>
+        </w:rPr>
+        <w:t xml:space="preserve">Report: </w:t>
+      </w:r>
+      <w:hyperlink r:id="rId19">
+        <w:r>
+          <w:rPr>
+            <w:color w:val="285B9D"/>
+            <w:u w:val="single"/>
+            <w:rFonts w:eastAsia="Arial Unicode MS" w:ascii="Calibri" w:hAnsi="Calibri"/>
+          </w:rPr>
+          <w:t>reports/archive-778da304d57a</w:t>
+        </w:r>
+      </w:hyperlink>
+    </w:p>
+    <w:p>
+      <w:pPr>
+        <w:spacing w:before="0" w:after="40" w:line="264" w:lineRule="auto"/>
+      </w:pPr>
+      <w:r>
+        <w:rPr>
+          <w:rFonts w:ascii="Calibri" w:hAnsi="Calibri" w:eastAsia="Arial Unicode MS"/>
+          <w:b/>
+          <w:i w:val="0"/>
+          <w:color w:val="0B2545"/>
+          <w:sz w:val="23"/>
+        </w:rPr>
+        <w:t>3. 2026-07-20 — 美国更高终端利率与全球电网设备短缺对中国的双向传导：人民币约束、政策空间与A股...</w:t>
       </w:r>
     </w:p>
     <w:p>
@@ -740,7 +880,7 @@
         </w:rPr>
         <w:t xml:space="preserve">Report: </w:t>
       </w:r>
-      <w:hyperlink r:id="rId12">
+      <w:hyperlink r:id="rId20">
         <w:r>
           <w:rPr>
             <w:color w:val="285B9D"/>
@@ -763,7 +903,147 @@
           <w:color w:val="0B2545"/>
           <w:sz w:val="23"/>
         </w:rPr>
-        <w:t>2. prior research notes— AI基础设施电力与信用瓶颈的宏观通胀与资本开支效应：对美国结构性通胀、...</w:t>
+        <w:t>4. 硅电锁死与再通胀：AI算力电力通胀向核心PCE的传导路径与降息周期的利率定价博弈</w:t>
+      </w:r>
+    </w:p>
+    <w:p>
+      <w:pPr>
+        <w:spacing w:before="0" w:after="40" w:line="264" w:lineRule="auto"/>
+      </w:pPr>
+      <w:r>
+        <w:rPr>
+          <w:rFonts w:ascii="Calibri" w:hAnsi="Calibri" w:eastAsia="Arial Unicode MS"/>
+          <w:b w:val="0"/>
+          <w:i w:val="0"/>
+          <w:color w:val="667085"/>
+          <w:sz w:val="17"/>
+        </w:rPr>
+        <w:t>未识别 · 宏观通胀传导 · score 49.6</w:t>
+      </w:r>
+    </w:p>
+    <w:p>
+      <w:pPr>
+        <w:spacing w:before="0" w:after="100" w:line="264" w:lineRule="auto"/>
+      </w:pPr>
+      <w:r>
+        <w:rPr>
+          <w:rFonts w:ascii="Calibri" w:hAnsi="Calibri" w:eastAsia="Arial Unicode MS"/>
+          <w:b w:val="0"/>
+          <w:i w:val="0"/>
+          <w:color w:val="334155"/>
+          <w:sz w:val="20"/>
+        </w:rPr>
+        <w:t>硅电锁死与再通胀：AI算力电力通胀向核心PCE的传导路径与降息周期的利率定价博弈</w:t>
+      </w:r>
+    </w:p>
+    <w:p>
+      <w:pPr>
+        <w:spacing w:before="0" w:after="160" w:line="264" w:lineRule="auto"/>
+      </w:pPr>
+      <w:r>
+        <w:rPr>
+          <w:rFonts w:ascii="Calibri" w:hAnsi="Calibri" w:eastAsia="Arial Unicode MS"/>
+          <w:b w:val="0"/>
+          <w:i w:val="0"/>
+          <w:color w:val="667085"/>
+          <w:sz w:val="17"/>
+        </w:rPr>
+        <w:t xml:space="preserve">Report: </w:t>
+      </w:r>
+      <w:hyperlink r:id="rId21">
+        <w:r>
+          <w:rPr>
+            <w:color w:val="285B9D"/>
+            <w:u w:val="single"/>
+            <w:rFonts w:eastAsia="Arial Unicode MS" w:ascii="Calibri" w:hAnsi="Calibri"/>
+          </w:rPr>
+          <w:t>reports/archive-8d3e283c741e</w:t>
+        </w:r>
+      </w:hyperlink>
+    </w:p>
+    <w:p>
+      <w:pPr>
+        <w:spacing w:before="0" w:after="40" w:line="264" w:lineRule="auto"/>
+      </w:pPr>
+      <w:r>
+        <w:rPr>
+          <w:rFonts w:ascii="Calibri" w:hAnsi="Calibri" w:eastAsia="Arial Unicode MS"/>
+          <w:b/>
+          <w:i w:val="0"/>
+          <w:color w:val="0B2545"/>
+          <w:sz w:val="23"/>
+        </w:rPr>
+        <w:t>5. AI 产业动态追踪报告 (AI Industry Tracker)</w:t>
+      </w:r>
+    </w:p>
+    <w:p>
+      <w:pPr>
+        <w:spacing w:before="0" w:after="40" w:line="264" w:lineRule="auto"/>
+      </w:pPr>
+      <w:r>
+        <w:rPr>
+          <w:rFonts w:ascii="Calibri" w:hAnsi="Calibri" w:eastAsia="Arial Unicode MS"/>
+          <w:b w:val="0"/>
+          <w:i w:val="0"/>
+          <w:color w:val="667085"/>
+          <w:sz w:val="17"/>
+        </w:rPr>
+        <w:t>未识别 · 宏观通胀传导 · score 49.5</w:t>
+      </w:r>
+    </w:p>
+    <w:p>
+      <w:pPr>
+        <w:spacing w:before="0" w:after="100" w:line="264" w:lineRule="auto"/>
+      </w:pPr>
+      <w:r>
+        <w:rPr>
+          <w:rFonts w:ascii="Calibri" w:hAnsi="Calibri" w:eastAsia="Arial Unicode MS"/>
+          <w:b w:val="0"/>
+          <w:i w:val="0"/>
+          <w:color w:val="334155"/>
+          <w:sz w:val="20"/>
+        </w:rPr>
+        <w:t>模型侧价格战与商业化分化： 2026年7月，头部大模型厂商（OpenAI、Meta、xAI、Anthropic）在经历6月的监管/出口管制风波后，于本月密集发布或重新部署新一代模型，降本增效和Agent化（Agentic c...</w:t>
+      </w:r>
+    </w:p>
+    <w:p>
+      <w:pPr>
+        <w:spacing w:before="0" w:after="160" w:line="264" w:lineRule="auto"/>
+      </w:pPr>
+      <w:r>
+        <w:rPr>
+          <w:rFonts w:ascii="Calibri" w:hAnsi="Calibri" w:eastAsia="Arial Unicode MS"/>
+          <w:b w:val="0"/>
+          <w:i w:val="0"/>
+          <w:color w:val="667085"/>
+          <w:sz w:val="17"/>
+        </w:rPr>
+        <w:t xml:space="preserve">Report: </w:t>
+      </w:r>
+      <w:hyperlink r:id="rId22">
+        <w:r>
+          <w:rPr>
+            <w:color w:val="285B9D"/>
+            <w:u w:val="single"/>
+            <w:rFonts w:eastAsia="Arial Unicode MS" w:ascii="Calibri" w:hAnsi="Calibri"/>
+          </w:rPr>
+          <w:t>reports/archive-fc9245e72f9f</w:t>
+        </w:r>
+      </w:hyperlink>
+    </w:p>
+    <w:p>
+      <w:pPr>
+        <w:spacing w:before="0" w:after="40" w:line="264" w:lineRule="auto"/>
+      </w:pPr>
+      <w:r>
+        <w:rPr>
+          <w:rFonts w:ascii="Calibri" w:hAnsi="Calibri" w:eastAsia="Arial Unicode MS"/>
+          <w:b/>
+          <w:i w:val="0"/>
+          <w:color w:val="0B2545"/>
+          <w:sz w:val="23"/>
+        </w:rPr>
+        <w:t>6. prior research notes— AI基础设施电力与信用瓶颈的宏观通胀与资本开支效应：对美国结构性通胀、...</w:t>
       </w:r>
     </w:p>
     <w:p>
@@ -810,7 +1090,7 @@
         </w:rPr>
         <w:t xml:space="preserve">Report: </w:t>
       </w:r>
-      <w:hyperlink r:id="rId19">
+      <w:hyperlink r:id="rId23">
         <w:r>
           <w:rPr>
             <w:color w:val="285B9D"/>
@@ -818,286 +1098,6 @@
             <w:rFonts w:eastAsia="Arial Unicode MS" w:ascii="Calibri" w:hAnsi="Calibri"/>
           </w:rPr>
           <w:t>reports/archive-047daba6b595</w:t>
-        </w:r>
-      </w:hyperlink>
-    </w:p>
-    <w:p>
-      <w:pPr>
-        <w:spacing w:before="0" w:after="40" w:line="264" w:lineRule="auto"/>
-      </w:pPr>
-      <w:r>
-        <w:rPr>
-          <w:rFonts w:ascii="Calibri" w:hAnsi="Calibri" w:eastAsia="Arial Unicode MS"/>
-          <w:b/>
-          <w:i w:val="0"/>
-          <w:color w:val="0B2545"/>
-          <w:sz w:val="23"/>
-        </w:rPr>
-        <w:t>3. 压力测试CPO对冲方案：先进封装瓶颈是否会从逻辑芯片传导至光电集成领域？</w:t>
-      </w:r>
-    </w:p>
-    <w:p>
-      <w:pPr>
-        <w:spacing w:before="0" w:after="40" w:line="264" w:lineRule="auto"/>
-      </w:pPr>
-      <w:r>
-        <w:rPr>
-          <w:rFonts w:ascii="Calibri" w:hAnsi="Calibri" w:eastAsia="Arial Unicode MS"/>
-          <w:b w:val="0"/>
-          <w:i w:val="0"/>
-          <w:color w:val="667085"/>
-          <w:sz w:val="17"/>
-        </w:rPr>
-        <w:t>未识别 · 半导体与存储 · score 46.7</w:t>
-      </w:r>
-    </w:p>
-    <w:p>
-      <w:pPr>
-        <w:spacing w:before="0" w:after="100" w:line="264" w:lineRule="auto"/>
-      </w:pPr>
-      <w:r>
-        <w:rPr>
-          <w:rFonts w:ascii="Calibri" w:hAnsi="Calibri" w:eastAsia="Arial Unicode MS"/>
-          <w:b w:val="0"/>
-          <w:i w:val="0"/>
-          <w:color w:val="334155"/>
-          <w:sz w:val="20"/>
-        </w:rPr>
-        <w:t>压力测试CPO对冲方案：先进封装瓶颈是否会从逻辑芯片传导至光电集成领域？</w:t>
-      </w:r>
-    </w:p>
-    <w:p>
-      <w:pPr>
-        <w:spacing w:before="0" w:after="160" w:line="264" w:lineRule="auto"/>
-      </w:pPr>
-      <w:r>
-        <w:rPr>
-          <w:rFonts w:ascii="Calibri" w:hAnsi="Calibri" w:eastAsia="Arial Unicode MS"/>
-          <w:b w:val="0"/>
-          <w:i w:val="0"/>
-          <w:color w:val="667085"/>
-          <w:sz w:val="17"/>
-        </w:rPr>
-        <w:t xml:space="preserve">Report: </w:t>
-      </w:r>
-      <w:hyperlink r:id="rId20">
-        <w:r>
-          <w:rPr>
-            <w:color w:val="285B9D"/>
-            <w:u w:val="single"/>
-            <w:rFonts w:eastAsia="Arial Unicode MS" w:ascii="Calibri" w:hAnsi="Calibri"/>
-          </w:rPr>
-          <w:t>reports/archive-e3b11ed1d035</w:t>
-        </w:r>
-      </w:hyperlink>
-    </w:p>
-    <w:p>
-      <w:pPr>
-        <w:spacing w:before="0" w:after="40" w:line="264" w:lineRule="auto"/>
-      </w:pPr>
-      <w:r>
-        <w:rPr>
-          <w:rFonts w:ascii="Calibri" w:hAnsi="Calibri" w:eastAsia="Arial Unicode MS"/>
-          <w:b/>
-          <w:i w:val="0"/>
-          <w:color w:val="0B2545"/>
-          <w:sz w:val="23"/>
-        </w:rPr>
-        <w:t>4. 2026-07-20 压力测试：数据中心照付不议电力合同的信用工具属性</w:t>
-      </w:r>
-    </w:p>
-    <w:p>
-      <w:pPr>
-        <w:spacing w:before="0" w:after="40" w:line="264" w:lineRule="auto"/>
-      </w:pPr>
-      <w:r>
-        <w:rPr>
-          <w:rFonts w:ascii="Calibri" w:hAnsi="Calibri" w:eastAsia="Arial Unicode MS"/>
-          <w:b w:val="0"/>
-          <w:i w:val="0"/>
-          <w:color w:val="667085"/>
-          <w:sz w:val="17"/>
-        </w:rPr>
-        <w:t>未识别 · AI 基础设施 · score 46.2</w:t>
-      </w:r>
-    </w:p>
-    <w:p>
-      <w:pPr>
-        <w:spacing w:before="0" w:after="100" w:line="264" w:lineRule="auto"/>
-      </w:pPr>
-      <w:r>
-        <w:rPr>
-          <w:rFonts w:ascii="Calibri" w:hAnsi="Calibri" w:eastAsia="Arial Unicode MS"/>
-          <w:b w:val="0"/>
-          <w:i w:val="0"/>
-          <w:color w:val="334155"/>
-          <w:sz w:val="20"/>
-        </w:rPr>
-        <w:t>作者： credit-analyst · 立场： stress-test 主题： 数据中心照付不议电力合同的交易对手信用与抵押结构 工作日期： 2026-07-20 （亚洲/新加坡）</w:t>
-      </w:r>
-    </w:p>
-    <w:p>
-      <w:pPr>
-        <w:spacing w:before="0" w:after="160" w:line="264" w:lineRule="auto"/>
-      </w:pPr>
-      <w:r>
-        <w:rPr>
-          <w:rFonts w:ascii="Calibri" w:hAnsi="Calibri" w:eastAsia="Arial Unicode MS"/>
-          <w:b w:val="0"/>
-          <w:i w:val="0"/>
-          <w:color w:val="667085"/>
-          <w:sz w:val="17"/>
-        </w:rPr>
-        <w:t xml:space="preserve">Report: </w:t>
-      </w:r>
-      <w:hyperlink r:id="rId21">
-        <w:r>
-          <w:rPr>
-            <w:color w:val="285B9D"/>
-            <w:u w:val="single"/>
-            <w:rFonts w:eastAsia="Arial Unicode MS" w:ascii="Calibri" w:hAnsi="Calibri"/>
-          </w:rPr>
-          <w:t>reports/archive-ae5de291c389</w:t>
-        </w:r>
-      </w:hyperlink>
-    </w:p>
-    <w:p>
-      <w:pPr>
-        <w:spacing w:before="0" w:after="40" w:line="264" w:lineRule="auto"/>
-      </w:pPr>
-      <w:r>
-        <w:rPr>
-          <w:rFonts w:ascii="Calibri" w:hAnsi="Calibri" w:eastAsia="Arial Unicode MS"/>
-          <w:b/>
-          <w:i w:val="0"/>
-          <w:color w:val="0B2545"/>
-          <w:sz w:val="23"/>
-        </w:rPr>
-        <w:t>5. 2026-07-20 压力测试：PJM 数据中心容量成本、零售传导与大负荷电价机制</w:t>
-      </w:r>
-    </w:p>
-    <w:p>
-      <w:pPr>
-        <w:spacing w:before="0" w:after="40" w:line="264" w:lineRule="auto"/>
-      </w:pPr>
-      <w:r>
-        <w:rPr>
-          <w:rFonts w:ascii="Calibri" w:hAnsi="Calibri" w:eastAsia="Arial Unicode MS"/>
-          <w:b w:val="0"/>
-          <w:i w:val="0"/>
-          <w:color w:val="667085"/>
-          <w:sz w:val="17"/>
-        </w:rPr>
-        <w:t>未识别 · AI 基础设施 · score 44.5</w:t>
-      </w:r>
-    </w:p>
-    <w:p>
-      <w:pPr>
-        <w:spacing w:before="0" w:after="100" w:line="264" w:lineRule="auto"/>
-      </w:pPr>
-      <w:r>
-        <w:rPr>
-          <w:rFonts w:ascii="Calibri" w:hAnsi="Calibri" w:eastAsia="Arial Unicode MS"/>
-          <w:b w:val="0"/>
-          <w:i w:val="0"/>
-          <w:color w:val="334155"/>
-          <w:sz w:val="20"/>
-        </w:rPr>
-        <w:t>2026-07-20 压力测试：PJM 数据中心容量成本、零售传导与大负荷电价机制</w:t>
-      </w:r>
-    </w:p>
-    <w:p>
-      <w:pPr>
-        <w:spacing w:before="0" w:after="160" w:line="264" w:lineRule="auto"/>
-      </w:pPr>
-      <w:r>
-        <w:rPr>
-          <w:rFonts w:ascii="Calibri" w:hAnsi="Calibri" w:eastAsia="Arial Unicode MS"/>
-          <w:b w:val="0"/>
-          <w:i w:val="0"/>
-          <w:color w:val="667085"/>
-          <w:sz w:val="17"/>
-        </w:rPr>
-        <w:t xml:space="preserve">Report: </w:t>
-      </w:r>
-      <w:hyperlink r:id="rId22">
-        <w:r>
-          <w:rPr>
-            <w:color w:val="285B9D"/>
-            <w:u w:val="single"/>
-            <w:rFonts w:eastAsia="Arial Unicode MS" w:ascii="Calibri" w:hAnsi="Calibri"/>
-          </w:rPr>
-          <w:t>reports/archive-0371be527599</w:t>
-        </w:r>
-      </w:hyperlink>
-    </w:p>
-    <w:p>
-      <w:pPr>
-        <w:spacing w:before="0" w:after="40" w:line="264" w:lineRule="auto"/>
-      </w:pPr>
-      <w:r>
-        <w:rPr>
-          <w:rFonts w:ascii="Calibri" w:hAnsi="Calibri" w:eastAsia="Arial Unicode MS"/>
-          <w:b/>
-          <w:i w:val="0"/>
-          <w:color w:val="0B2545"/>
-          <w:sz w:val="23"/>
-        </w:rPr>
-        <w:t>6. 2026年7月20日 — 压力测试：电力缺口能否支撑超大规模厂商扩容？电网重定价是否真的削弱了公用事...</w:t>
-      </w:r>
-    </w:p>
-    <w:p>
-      <w:pPr>
-        <w:spacing w:before="0" w:after="40" w:line="264" w:lineRule="auto"/>
-      </w:pPr>
-      <w:r>
-        <w:rPr>
-          <w:rFonts w:ascii="Calibri" w:hAnsi="Calibri" w:eastAsia="Arial Unicode MS"/>
-          <w:b w:val="0"/>
-          <w:i w:val="0"/>
-          <w:color w:val="667085"/>
-          <w:sz w:val="17"/>
-        </w:rPr>
-        <w:t>未识别 · 电力与电网 · score 43.4</w:t>
-      </w:r>
-    </w:p>
-    <w:p>
-      <w:pPr>
-        <w:spacing w:before="0" w:after="100" w:line="264" w:lineRule="auto"/>
-      </w:pPr>
-      <w:r>
-        <w:rPr>
-          <w:rFonts w:ascii="Calibri" w:hAnsi="Calibri" w:eastAsia="Arial Unicode MS"/>
-          <w:b w:val="0"/>
-          <w:i w:val="0"/>
-          <w:color w:val="334155"/>
-          <w:sz w:val="20"/>
-        </w:rPr>
-        <w:t>2026年7月20日 — 压力测试：电力缺口能否支撑超大规模厂商扩容？电网重定价是否真的削弱了公用事业多空中的"AI资本开支因子"？</w:t>
-      </w:r>
-    </w:p>
-    <w:p>
-      <w:pPr>
-        <w:spacing w:before="0" w:after="160" w:line="264" w:lineRule="auto"/>
-      </w:pPr>
-      <w:r>
-        <w:rPr>
-          <w:rFonts w:ascii="Calibri" w:hAnsi="Calibri" w:eastAsia="Arial Unicode MS"/>
-          <w:b w:val="0"/>
-          <w:i w:val="0"/>
-          <w:color w:val="667085"/>
-          <w:sz w:val="17"/>
-        </w:rPr>
-        <w:t xml:space="preserve">Report: </w:t>
-      </w:r>
-      <w:hyperlink r:id="rId23">
-        <w:r>
-          <w:rPr>
-            <w:color w:val="285B9D"/>
-            <w:u w:val="single"/>
-            <w:rFonts w:eastAsia="Arial Unicode MS" w:ascii="Calibri" w:hAnsi="Calibri"/>
-          </w:rPr>
-          <w:t>reports/archive-0802fd46e5d1</w:t>
         </w:r>
       </w:hyperlink>
     </w:p>
@@ -1431,6 +1431,224 @@
                 <w:color w:val="111827"/>
                 <w:sz w:val="17"/>
               </w:rPr>
+              <w:t>策略工作日期 2026-07-20</w:t>
+            </w:r>
+          </w:p>
+        </w:tc>
+        <w:tc>
+          <w:tcPr>
+            <w:tcW w:type="dxa" w:w="1560"/>
+            <w:vAlign w:val="center"/>
+          </w:tcPr>
+          <w:p>
+            <w:pPr>
+              <w:spacing w:before="0" w:after="0"/>
+            </w:pPr>
+            <w:r/>
+            <w:r>
+              <w:rPr>
+                <w:rFonts w:ascii="Calibri" w:hAnsi="Calibri" w:eastAsia="Arial Unicode MS"/>
+                <w:b w:val="0"/>
+                <w:color w:val="111827"/>
+                <w:sz w:val="16"/>
+              </w:rPr>
+              <w:t>未识别</w:t>
+            </w:r>
+          </w:p>
+        </w:tc>
+        <w:tc>
+          <w:tcPr>
+            <w:tcW w:type="dxa" w:w="1680"/>
+            <w:vAlign w:val="center"/>
+          </w:tcPr>
+          <w:p>
+            <w:pPr>
+              <w:spacing w:before="0" w:after="0"/>
+            </w:pPr>
+            <w:r/>
+            <w:r>
+              <w:rPr>
+                <w:rFonts w:ascii="Calibri" w:hAnsi="Calibri" w:eastAsia="Arial Unicode MS"/>
+                <w:b w:val="0"/>
+                <w:color w:val="111827"/>
+                <w:sz w:val="16"/>
+              </w:rPr>
+              <w:t>电力与电网</w:t>
+            </w:r>
+          </w:p>
+        </w:tc>
+        <w:tc>
+          <w:tcPr>
+            <w:tcW w:type="dxa" w:w="900"/>
+            <w:vAlign w:val="center"/>
+          </w:tcPr>
+          <w:p>
+            <w:pPr>
+              <w:spacing w:before="0" w:after="0"/>
+              <w:jc w:val="center"/>
+            </w:pPr>
+            <w:r/>
+            <w:r>
+              <w:rPr>
+                <w:rFonts w:ascii="Calibri" w:hAnsi="Calibri" w:eastAsia="Arial Unicode MS"/>
+                <w:b/>
+                <w:color w:val="111827"/>
+                <w:sz w:val="17"/>
+              </w:rPr>
+              <w:t>52.0</w:t>
+            </w:r>
+          </w:p>
+        </w:tc>
+        <w:tc>
+          <w:tcPr>
+            <w:tcW w:type="dxa" w:w="1500"/>
+            <w:vAlign w:val="center"/>
+          </w:tcPr>
+          <w:p>
+            <w:pPr>
+              <w:spacing w:before="0" w:after="0"/>
+              <w:jc w:val="center"/>
+            </w:pPr>
+            <w:r/>
+            <w:r>
+              <w:rPr>
+                <w:rFonts w:ascii="Calibri" w:hAnsi="Calibri" w:eastAsia="Arial Unicode MS"/>
+                <w:b w:val="0"/>
+                <w:color w:val="111827"/>
+                <w:sz w:val="16"/>
+              </w:rPr>
+              <w:t>风险 1</w:t>
+            </w:r>
+          </w:p>
+        </w:tc>
+      </w:tr>
+      <w:tr>
+        <w:tc>
+          <w:tcPr>
+            <w:tcW w:type="dxa" w:w="3720"/>
+            <w:vAlign w:val="center"/>
+          </w:tcPr>
+          <w:p>
+            <w:pPr>
+              <w:spacing w:before="0" w:after="0"/>
+            </w:pPr>
+            <w:r/>
+            <w:r>
+              <w:rPr>
+                <w:rFonts w:ascii="Calibri" w:hAnsi="Calibri" w:eastAsia="Arial Unicode MS"/>
+                <w:b w:val="0"/>
+                <w:color w:val="111827"/>
+                <w:sz w:val="17"/>
+              </w:rPr>
+              <w:t>AI基础设施工作日期 2026-07-20</w:t>
+            </w:r>
+          </w:p>
+        </w:tc>
+        <w:tc>
+          <w:tcPr>
+            <w:tcW w:type="dxa" w:w="1560"/>
+            <w:vAlign w:val="center"/>
+          </w:tcPr>
+          <w:p>
+            <w:pPr>
+              <w:spacing w:before="0" w:after="0"/>
+            </w:pPr>
+            <w:r/>
+            <w:r>
+              <w:rPr>
+                <w:rFonts w:ascii="Calibri" w:hAnsi="Calibri" w:eastAsia="Arial Unicode MS"/>
+                <w:b w:val="0"/>
+                <w:color w:val="111827"/>
+                <w:sz w:val="16"/>
+              </w:rPr>
+              <w:t>未识别</w:t>
+            </w:r>
+          </w:p>
+        </w:tc>
+        <w:tc>
+          <w:tcPr>
+            <w:tcW w:type="dxa" w:w="1680"/>
+            <w:vAlign w:val="center"/>
+          </w:tcPr>
+          <w:p>
+            <w:pPr>
+              <w:spacing w:before="0" w:after="0"/>
+            </w:pPr>
+            <w:r/>
+            <w:r>
+              <w:rPr>
+                <w:rFonts w:ascii="Calibri" w:hAnsi="Calibri" w:eastAsia="Arial Unicode MS"/>
+                <w:b w:val="0"/>
+                <w:color w:val="111827"/>
+                <w:sz w:val="16"/>
+              </w:rPr>
+              <w:t>AI 基础设施</w:t>
+            </w:r>
+          </w:p>
+        </w:tc>
+        <w:tc>
+          <w:tcPr>
+            <w:tcW w:type="dxa" w:w="900"/>
+            <w:vAlign w:val="center"/>
+          </w:tcPr>
+          <w:p>
+            <w:pPr>
+              <w:spacing w:before="0" w:after="0"/>
+              <w:jc w:val="center"/>
+            </w:pPr>
+            <w:r/>
+            <w:r>
+              <w:rPr>
+                <w:rFonts w:ascii="Calibri" w:hAnsi="Calibri" w:eastAsia="Arial Unicode MS"/>
+                <w:b/>
+                <w:color w:val="111827"/>
+                <w:sz w:val="17"/>
+              </w:rPr>
+              <w:t>50.5</w:t>
+            </w:r>
+          </w:p>
+        </w:tc>
+        <w:tc>
+          <w:tcPr>
+            <w:tcW w:type="dxa" w:w="1500"/>
+            <w:vAlign w:val="center"/>
+          </w:tcPr>
+          <w:p>
+            <w:pPr>
+              <w:spacing w:before="0" w:after="0"/>
+              <w:jc w:val="center"/>
+            </w:pPr>
+            <w:r/>
+            <w:r>
+              <w:rPr>
+                <w:rFonts w:ascii="Calibri" w:hAnsi="Calibri" w:eastAsia="Arial Unicode MS"/>
+                <w:b w:val="0"/>
+                <w:color w:val="111827"/>
+                <w:sz w:val="16"/>
+              </w:rPr>
+              <w:t>风险 3</w:t>
+            </w:r>
+          </w:p>
+        </w:tc>
+      </w:tr>
+      <w:tr>
+        <w:tc>
+          <w:tcPr>
+            <w:tcW w:type="dxa" w:w="3720"/>
+            <w:vAlign w:val="center"/>
+          </w:tcPr>
+          <w:p>
+            <w:pPr>
+              <w:spacing w:before="0" w:after="0"/>
+            </w:pPr>
+            <w:r/>
+            <w:r>
+              <w:rPr>
+                <w:rFonts w:ascii="Calibri" w:hAnsi="Calibri" w:eastAsia="Arial Unicode MS"/>
+                <w:b w:val="0"/>
+                <w:color w:val="111827"/>
+                <w:sz w:val="17"/>
+              </w:rPr>
               <w:t>2026-07-20 — 美国更高终端利率与全球电网设备短缺对中国的双向传导：人民币约束、政策空间与A股...</w:t>
             </w:r>
           </w:p>
@@ -1540,6 +1758,224 @@
                 <w:color w:val="111827"/>
                 <w:sz w:val="17"/>
               </w:rPr>
+              <w:t>硅电锁死与再通胀：AI算力电力通胀向核心PCE的传导路径与降息周期的利率定价博弈</w:t>
+            </w:r>
+          </w:p>
+        </w:tc>
+        <w:tc>
+          <w:tcPr>
+            <w:tcW w:type="dxa" w:w="1560"/>
+            <w:vAlign w:val="center"/>
+          </w:tcPr>
+          <w:p>
+            <w:pPr>
+              <w:spacing w:before="0" w:after="0"/>
+            </w:pPr>
+            <w:r/>
+            <w:r>
+              <w:rPr>
+                <w:rFonts w:ascii="Calibri" w:hAnsi="Calibri" w:eastAsia="Arial Unicode MS"/>
+                <w:b w:val="0"/>
+                <w:color w:val="111827"/>
+                <w:sz w:val="16"/>
+              </w:rPr>
+              <w:t>未识别</w:t>
+            </w:r>
+          </w:p>
+        </w:tc>
+        <w:tc>
+          <w:tcPr>
+            <w:tcW w:type="dxa" w:w="1680"/>
+            <w:vAlign w:val="center"/>
+          </w:tcPr>
+          <w:p>
+            <w:pPr>
+              <w:spacing w:before="0" w:after="0"/>
+            </w:pPr>
+            <w:r/>
+            <w:r>
+              <w:rPr>
+                <w:rFonts w:ascii="Calibri" w:hAnsi="Calibri" w:eastAsia="Arial Unicode MS"/>
+                <w:b w:val="0"/>
+                <w:color w:val="111827"/>
+                <w:sz w:val="16"/>
+              </w:rPr>
+              <w:t>宏观通胀传导</w:t>
+            </w:r>
+          </w:p>
+        </w:tc>
+        <w:tc>
+          <w:tcPr>
+            <w:tcW w:type="dxa" w:w="900"/>
+            <w:vAlign w:val="center"/>
+          </w:tcPr>
+          <w:p>
+            <w:pPr>
+              <w:spacing w:before="0" w:after="0"/>
+              <w:jc w:val="center"/>
+            </w:pPr>
+            <w:r/>
+            <w:r>
+              <w:rPr>
+                <w:rFonts w:ascii="Calibri" w:hAnsi="Calibri" w:eastAsia="Arial Unicode MS"/>
+                <w:b/>
+                <w:color w:val="111827"/>
+                <w:sz w:val="17"/>
+              </w:rPr>
+              <w:t>49.6</w:t>
+            </w:r>
+          </w:p>
+        </w:tc>
+        <w:tc>
+          <w:tcPr>
+            <w:tcW w:type="dxa" w:w="1500"/>
+            <w:vAlign w:val="center"/>
+          </w:tcPr>
+          <w:p>
+            <w:pPr>
+              <w:spacing w:before="0" w:after="0"/>
+              <w:jc w:val="center"/>
+            </w:pPr>
+            <w:r/>
+            <w:r>
+              <w:rPr>
+                <w:rFonts w:ascii="Calibri" w:hAnsi="Calibri" w:eastAsia="Arial Unicode MS"/>
+                <w:b w:val="0"/>
+                <w:color w:val="111827"/>
+                <w:sz w:val="16"/>
+              </w:rPr>
+              <w:t>风险 1</w:t>
+            </w:r>
+          </w:p>
+        </w:tc>
+      </w:tr>
+      <w:tr>
+        <w:tc>
+          <w:tcPr>
+            <w:tcW w:type="dxa" w:w="3720"/>
+            <w:vAlign w:val="center"/>
+          </w:tcPr>
+          <w:p>
+            <w:pPr>
+              <w:spacing w:before="0" w:after="0"/>
+            </w:pPr>
+            <w:r/>
+            <w:r>
+              <w:rPr>
+                <w:rFonts w:ascii="Calibri" w:hAnsi="Calibri" w:eastAsia="Arial Unicode MS"/>
+                <w:b w:val="0"/>
+                <w:color w:val="111827"/>
+                <w:sz w:val="17"/>
+              </w:rPr>
+              <w:t>AI 产业动态追踪报告 (AI Industry Tracker)</w:t>
+            </w:r>
+          </w:p>
+        </w:tc>
+        <w:tc>
+          <w:tcPr>
+            <w:tcW w:type="dxa" w:w="1560"/>
+            <w:vAlign w:val="center"/>
+          </w:tcPr>
+          <w:p>
+            <w:pPr>
+              <w:spacing w:before="0" w:after="0"/>
+            </w:pPr>
+            <w:r/>
+            <w:r>
+              <w:rPr>
+                <w:rFonts w:ascii="Calibri" w:hAnsi="Calibri" w:eastAsia="Arial Unicode MS"/>
+                <w:b w:val="0"/>
+                <w:color w:val="111827"/>
+                <w:sz w:val="16"/>
+              </w:rPr>
+              <w:t>未识别</w:t>
+            </w:r>
+          </w:p>
+        </w:tc>
+        <w:tc>
+          <w:tcPr>
+            <w:tcW w:type="dxa" w:w="1680"/>
+            <w:vAlign w:val="center"/>
+          </w:tcPr>
+          <w:p>
+            <w:pPr>
+              <w:spacing w:before="0" w:after="0"/>
+            </w:pPr>
+            <w:r/>
+            <w:r>
+              <w:rPr>
+                <w:rFonts w:ascii="Calibri" w:hAnsi="Calibri" w:eastAsia="Arial Unicode MS"/>
+                <w:b w:val="0"/>
+                <w:color w:val="111827"/>
+                <w:sz w:val="16"/>
+              </w:rPr>
+              <w:t>宏观通胀传导</w:t>
+            </w:r>
+          </w:p>
+        </w:tc>
+        <w:tc>
+          <w:tcPr>
+            <w:tcW w:type="dxa" w:w="900"/>
+            <w:vAlign w:val="center"/>
+          </w:tcPr>
+          <w:p>
+            <w:pPr>
+              <w:spacing w:before="0" w:after="0"/>
+              <w:jc w:val="center"/>
+            </w:pPr>
+            <w:r/>
+            <w:r>
+              <w:rPr>
+                <w:rFonts w:ascii="Calibri" w:hAnsi="Calibri" w:eastAsia="Arial Unicode MS"/>
+                <w:b/>
+                <w:color w:val="111827"/>
+                <w:sz w:val="17"/>
+              </w:rPr>
+              <w:t>49.5</w:t>
+            </w:r>
+          </w:p>
+        </w:tc>
+        <w:tc>
+          <w:tcPr>
+            <w:tcW w:type="dxa" w:w="1500"/>
+            <w:vAlign w:val="center"/>
+          </w:tcPr>
+          <w:p>
+            <w:pPr>
+              <w:spacing w:before="0" w:after="0"/>
+              <w:jc w:val="center"/>
+            </w:pPr>
+            <w:r/>
+            <w:r>
+              <w:rPr>
+                <w:rFonts w:ascii="Calibri" w:hAnsi="Calibri" w:eastAsia="Arial Unicode MS"/>
+                <w:b w:val="0"/>
+                <w:color w:val="111827"/>
+                <w:sz w:val="16"/>
+              </w:rPr>
+              <w:t>风险 2</w:t>
+            </w:r>
+          </w:p>
+        </w:tc>
+      </w:tr>
+      <w:tr>
+        <w:tc>
+          <w:tcPr>
+            <w:tcW w:type="dxa" w:w="3720"/>
+            <w:vAlign w:val="center"/>
+          </w:tcPr>
+          <w:p>
+            <w:pPr>
+              <w:spacing w:before="0" w:after="0"/>
+            </w:pPr>
+            <w:r/>
+            <w:r>
+              <w:rPr>
+                <w:rFonts w:ascii="Calibri" w:hAnsi="Calibri" w:eastAsia="Arial Unicode MS"/>
+                <w:b w:val="0"/>
+                <w:color w:val="111827"/>
+                <w:sz w:val="17"/>
+              </w:rPr>
               <w:t>prior research notes— AI基础设施电力与信用瓶颈的宏观通胀与资本开支效应：对美国结构性通胀、...</w:t>
             </w:r>
           </w:p>
@@ -1605,6 +2041,224 @@
                 <w:sz w:val="17"/>
               </w:rPr>
               <w:t>48.6</w:t>
+            </w:r>
+          </w:p>
+        </w:tc>
+        <w:tc>
+          <w:tcPr>
+            <w:tcW w:type="dxa" w:w="1500"/>
+            <w:vAlign w:val="center"/>
+          </w:tcPr>
+          <w:p>
+            <w:pPr>
+              <w:spacing w:before="0" w:after="0"/>
+              <w:jc w:val="center"/>
+            </w:pPr>
+            <w:r/>
+            <w:r>
+              <w:rPr>
+                <w:rFonts w:ascii="Calibri" w:hAnsi="Calibri" w:eastAsia="Arial Unicode MS"/>
+                <w:b w:val="0"/>
+                <w:color w:val="111827"/>
+                <w:sz w:val="16"/>
+              </w:rPr>
+              <w:t>风险 1</w:t>
+            </w:r>
+          </w:p>
+        </w:tc>
+      </w:tr>
+      <w:tr>
+        <w:tc>
+          <w:tcPr>
+            <w:tcW w:type="dxa" w:w="3720"/>
+            <w:vAlign w:val="center"/>
+          </w:tcPr>
+          <w:p>
+            <w:pPr>
+              <w:spacing w:before="0" w:after="0"/>
+            </w:pPr>
+            <w:r/>
+            <w:r>
+              <w:rPr>
+                <w:rFonts w:ascii="Calibri" w:hAnsi="Calibri" w:eastAsia="Arial Unicode MS"/>
+                <w:b w:val="0"/>
+                <w:color w:val="111827"/>
+                <w:sz w:val="17"/>
+              </w:rPr>
+              <w:t>策略工作日期 2026-07-20</w:t>
+            </w:r>
+          </w:p>
+        </w:tc>
+        <w:tc>
+          <w:tcPr>
+            <w:tcW w:type="dxa" w:w="1560"/>
+            <w:vAlign w:val="center"/>
+          </w:tcPr>
+          <w:p>
+            <w:pPr>
+              <w:spacing w:before="0" w:after="0"/>
+            </w:pPr>
+            <w:r/>
+            <w:r>
+              <w:rPr>
+                <w:rFonts w:ascii="Calibri" w:hAnsi="Calibri" w:eastAsia="Arial Unicode MS"/>
+                <w:b w:val="0"/>
+                <w:color w:val="111827"/>
+                <w:sz w:val="16"/>
+              </w:rPr>
+              <w:t>未识别</w:t>
+            </w:r>
+          </w:p>
+        </w:tc>
+        <w:tc>
+          <w:tcPr>
+            <w:tcW w:type="dxa" w:w="1680"/>
+            <w:vAlign w:val="center"/>
+          </w:tcPr>
+          <w:p>
+            <w:pPr>
+              <w:spacing w:before="0" w:after="0"/>
+            </w:pPr>
+            <w:r/>
+            <w:r>
+              <w:rPr>
+                <w:rFonts w:ascii="Calibri" w:hAnsi="Calibri" w:eastAsia="Arial Unicode MS"/>
+                <w:b w:val="0"/>
+                <w:color w:val="111827"/>
+                <w:sz w:val="16"/>
+              </w:rPr>
+              <w:t>电力与电网</w:t>
+            </w:r>
+          </w:p>
+        </w:tc>
+        <w:tc>
+          <w:tcPr>
+            <w:tcW w:type="dxa" w:w="900"/>
+            <w:vAlign w:val="center"/>
+          </w:tcPr>
+          <w:p>
+            <w:pPr>
+              <w:spacing w:before="0" w:after="0"/>
+              <w:jc w:val="center"/>
+            </w:pPr>
+            <w:r/>
+            <w:r>
+              <w:rPr>
+                <w:rFonts w:ascii="Calibri" w:hAnsi="Calibri" w:eastAsia="Arial Unicode MS"/>
+                <w:b/>
+                <w:color w:val="111827"/>
+                <w:sz w:val="17"/>
+              </w:rPr>
+              <w:t>47.3</w:t>
+            </w:r>
+          </w:p>
+        </w:tc>
+        <w:tc>
+          <w:tcPr>
+            <w:tcW w:type="dxa" w:w="1500"/>
+            <w:vAlign w:val="center"/>
+          </w:tcPr>
+          <w:p>
+            <w:pPr>
+              <w:spacing w:before="0" w:after="0"/>
+              <w:jc w:val="center"/>
+            </w:pPr>
+            <w:r/>
+            <w:r>
+              <w:rPr>
+                <w:rFonts w:ascii="Calibri" w:hAnsi="Calibri" w:eastAsia="Arial Unicode MS"/>
+                <w:b w:val="0"/>
+                <w:color w:val="111827"/>
+                <w:sz w:val="16"/>
+              </w:rPr>
+              <w:t>风险 1</w:t>
+            </w:r>
+          </w:p>
+        </w:tc>
+      </w:tr>
+      <w:tr>
+        <w:tc>
+          <w:tcPr>
+            <w:tcW w:type="dxa" w:w="3720"/>
+            <w:vAlign w:val="center"/>
+          </w:tcPr>
+          <w:p>
+            <w:pPr>
+              <w:spacing w:before="0" w:after="0"/>
+            </w:pPr>
+            <w:r/>
+            <w:r>
+              <w:rPr>
+                <w:rFonts w:ascii="Calibri" w:hAnsi="Calibri" w:eastAsia="Arial Unicode MS"/>
+                <w:b w:val="0"/>
+                <w:color w:val="111827"/>
+                <w:sz w:val="17"/>
+              </w:rPr>
+              <w:t>research discussion Session Brief</w:t>
+            </w:r>
+          </w:p>
+        </w:tc>
+        <w:tc>
+          <w:tcPr>
+            <w:tcW w:type="dxa" w:w="1560"/>
+            <w:vAlign w:val="center"/>
+          </w:tcPr>
+          <w:p>
+            <w:pPr>
+              <w:spacing w:before="0" w:after="0"/>
+            </w:pPr>
+            <w:r/>
+            <w:r>
+              <w:rPr>
+                <w:rFonts w:ascii="Calibri" w:hAnsi="Calibri" w:eastAsia="Arial Unicode MS"/>
+                <w:b w:val="0"/>
+                <w:color w:val="111827"/>
+                <w:sz w:val="16"/>
+              </w:rPr>
+              <w:t>未识别</w:t>
+            </w:r>
+          </w:p>
+        </w:tc>
+        <w:tc>
+          <w:tcPr>
+            <w:tcW w:type="dxa" w:w="1680"/>
+            <w:vAlign w:val="center"/>
+          </w:tcPr>
+          <w:p>
+            <w:pPr>
+              <w:spacing w:before="0" w:after="0"/>
+            </w:pPr>
+            <w:r/>
+            <w:r>
+              <w:rPr>
+                <w:rFonts w:ascii="Calibri" w:hAnsi="Calibri" w:eastAsia="Arial Unicode MS"/>
+                <w:b w:val="0"/>
+                <w:color w:val="111827"/>
+                <w:sz w:val="16"/>
+              </w:rPr>
+              <w:t>AI 基础设施</w:t>
+            </w:r>
+          </w:p>
+        </w:tc>
+        <w:tc>
+          <w:tcPr>
+            <w:tcW w:type="dxa" w:w="900"/>
+            <w:vAlign w:val="center"/>
+          </w:tcPr>
+          <w:p>
+            <w:pPr>
+              <w:spacing w:before="0" w:after="0"/>
+              <w:jc w:val="center"/>
+            </w:pPr>
+            <w:r/>
+            <w:r>
+              <w:rPr>
+                <w:rFonts w:ascii="Calibri" w:hAnsi="Calibri" w:eastAsia="Arial Unicode MS"/>
+                <w:b/>
+                <w:color w:val="111827"/>
+                <w:sz w:val="17"/>
+              </w:rPr>
+              <w:t>47.0</w:t>
             </w:r>
           </w:p>
         </w:tc>
@@ -1867,6 +2521,660 @@
                 <w:color w:val="111827"/>
                 <w:sz w:val="17"/>
               </w:rPr>
+              <w:t>AI 算力电力死锁与硅-电脱耦：A股半导体估值重构与电网设备出口策略</w:t>
+            </w:r>
+          </w:p>
+        </w:tc>
+        <w:tc>
+          <w:tcPr>
+            <w:tcW w:type="dxa" w:w="1560"/>
+            <w:vAlign w:val="center"/>
+          </w:tcPr>
+          <w:p>
+            <w:pPr>
+              <w:spacing w:before="0" w:after="0"/>
+            </w:pPr>
+            <w:r/>
+            <w:r>
+              <w:rPr>
+                <w:rFonts w:ascii="Calibri" w:hAnsi="Calibri" w:eastAsia="Arial Unicode MS"/>
+                <w:b w:val="0"/>
+                <w:color w:val="111827"/>
+                <w:sz w:val="16"/>
+              </w:rPr>
+              <w:t>未识别</w:t>
+            </w:r>
+          </w:p>
+        </w:tc>
+        <w:tc>
+          <w:tcPr>
+            <w:tcW w:type="dxa" w:w="1680"/>
+            <w:vAlign w:val="center"/>
+          </w:tcPr>
+          <w:p>
+            <w:pPr>
+              <w:spacing w:before="0" w:after="0"/>
+            </w:pPr>
+            <w:r/>
+            <w:r>
+              <w:rPr>
+                <w:rFonts w:ascii="Calibri" w:hAnsi="Calibri" w:eastAsia="Arial Unicode MS"/>
+                <w:b w:val="0"/>
+                <w:color w:val="111827"/>
+                <w:sz w:val="16"/>
+              </w:rPr>
+              <w:t>AI 基础设施</w:t>
+            </w:r>
+          </w:p>
+        </w:tc>
+        <w:tc>
+          <w:tcPr>
+            <w:tcW w:type="dxa" w:w="900"/>
+            <w:vAlign w:val="center"/>
+          </w:tcPr>
+          <w:p>
+            <w:pPr>
+              <w:spacing w:before="0" w:after="0"/>
+              <w:jc w:val="center"/>
+            </w:pPr>
+            <w:r/>
+            <w:r>
+              <w:rPr>
+                <w:rFonts w:ascii="Calibri" w:hAnsi="Calibri" w:eastAsia="Arial Unicode MS"/>
+                <w:b/>
+                <w:color w:val="111827"/>
+                <w:sz w:val="17"/>
+              </w:rPr>
+              <w:t>46.0</w:t>
+            </w:r>
+          </w:p>
+        </w:tc>
+        <w:tc>
+          <w:tcPr>
+            <w:tcW w:type="dxa" w:w="1500"/>
+            <w:vAlign w:val="center"/>
+          </w:tcPr>
+          <w:p>
+            <w:pPr>
+              <w:spacing w:before="0" w:after="0"/>
+              <w:jc w:val="center"/>
+            </w:pPr>
+            <w:r/>
+            <w:r>
+              <w:rPr>
+                <w:rFonts w:ascii="Calibri" w:hAnsi="Calibri" w:eastAsia="Arial Unicode MS"/>
+                <w:b w:val="0"/>
+                <w:color w:val="111827"/>
+                <w:sz w:val="16"/>
+              </w:rPr>
+              <w:t>常规</w:t>
+            </w:r>
+          </w:p>
+        </w:tc>
+      </w:tr>
+      <w:tr>
+        <w:tc>
+          <w:tcPr>
+            <w:tcW w:type="dxa" w:w="3720"/>
+            <w:vAlign w:val="center"/>
+          </w:tcPr>
+          <w:p>
+            <w:pPr>
+              <w:spacing w:before="0" w:after="0"/>
+            </w:pPr>
+            <w:r/>
+            <w:r>
+              <w:rPr>
+                <w:rFonts w:ascii="Calibri" w:hAnsi="Calibri" w:eastAsia="Arial Unicode MS"/>
+                <w:b w:val="0"/>
+                <w:color w:val="111827"/>
+                <w:sz w:val="17"/>
+              </w:rPr>
+              <w:t>半导体工作日期 2026-07-20</w:t>
+            </w:r>
+          </w:p>
+        </w:tc>
+        <w:tc>
+          <w:tcPr>
+            <w:tcW w:type="dxa" w:w="1560"/>
+            <w:vAlign w:val="center"/>
+          </w:tcPr>
+          <w:p>
+            <w:pPr>
+              <w:spacing w:before="0" w:after="0"/>
+            </w:pPr>
+            <w:r/>
+            <w:r>
+              <w:rPr>
+                <w:rFonts w:ascii="Calibri" w:hAnsi="Calibri" w:eastAsia="Arial Unicode MS"/>
+                <w:b w:val="0"/>
+                <w:color w:val="111827"/>
+                <w:sz w:val="16"/>
+              </w:rPr>
+              <w:t>未识别</w:t>
+            </w:r>
+          </w:p>
+        </w:tc>
+        <w:tc>
+          <w:tcPr>
+            <w:tcW w:type="dxa" w:w="1680"/>
+            <w:vAlign w:val="center"/>
+          </w:tcPr>
+          <w:p>
+            <w:pPr>
+              <w:spacing w:before="0" w:after="0"/>
+            </w:pPr>
+            <w:r/>
+            <w:r>
+              <w:rPr>
+                <w:rFonts w:ascii="Calibri" w:hAnsi="Calibri" w:eastAsia="Arial Unicode MS"/>
+                <w:b w:val="0"/>
+                <w:color w:val="111827"/>
+                <w:sz w:val="16"/>
+              </w:rPr>
+              <w:t>宏观通胀传导</w:t>
+            </w:r>
+          </w:p>
+        </w:tc>
+        <w:tc>
+          <w:tcPr>
+            <w:tcW w:type="dxa" w:w="900"/>
+            <w:vAlign w:val="center"/>
+          </w:tcPr>
+          <w:p>
+            <w:pPr>
+              <w:spacing w:before="0" w:after="0"/>
+              <w:jc w:val="center"/>
+            </w:pPr>
+            <w:r/>
+            <w:r>
+              <w:rPr>
+                <w:rFonts w:ascii="Calibri" w:hAnsi="Calibri" w:eastAsia="Arial Unicode MS"/>
+                <w:b/>
+                <w:color w:val="111827"/>
+                <w:sz w:val="17"/>
+              </w:rPr>
+              <w:t>45.4</w:t>
+            </w:r>
+          </w:p>
+        </w:tc>
+        <w:tc>
+          <w:tcPr>
+            <w:tcW w:type="dxa" w:w="1500"/>
+            <w:vAlign w:val="center"/>
+          </w:tcPr>
+          <w:p>
+            <w:pPr>
+              <w:spacing w:before="0" w:after="0"/>
+              <w:jc w:val="center"/>
+            </w:pPr>
+            <w:r/>
+            <w:r>
+              <w:rPr>
+                <w:rFonts w:ascii="Calibri" w:hAnsi="Calibri" w:eastAsia="Arial Unicode MS"/>
+                <w:b w:val="0"/>
+                <w:color w:val="111827"/>
+                <w:sz w:val="16"/>
+              </w:rPr>
+              <w:t>风险 1</w:t>
+            </w:r>
+          </w:p>
+        </w:tc>
+      </w:tr>
+      <w:tr>
+        <w:tc>
+          <w:tcPr>
+            <w:tcW w:type="dxa" w:w="3720"/>
+            <w:vAlign w:val="center"/>
+          </w:tcPr>
+          <w:p>
+            <w:pPr>
+              <w:spacing w:before="0" w:after="0"/>
+            </w:pPr>
+            <w:r/>
+            <w:r>
+              <w:rPr>
+                <w:rFonts w:ascii="Calibri" w:hAnsi="Calibri" w:eastAsia="Arial Unicode MS"/>
+                <w:b w:val="0"/>
+                <w:color w:val="111827"/>
+                <w:sz w:val="17"/>
+              </w:rPr>
+              <w:t>2026-07-20 — 全球宏观研究记录：7月FOMC降息检验</w:t>
+            </w:r>
+          </w:p>
+        </w:tc>
+        <w:tc>
+          <w:tcPr>
+            <w:tcW w:type="dxa" w:w="1560"/>
+            <w:vAlign w:val="center"/>
+          </w:tcPr>
+          <w:p>
+            <w:pPr>
+              <w:spacing w:before="0" w:after="0"/>
+            </w:pPr>
+            <w:r/>
+            <w:r>
+              <w:rPr>
+                <w:rFonts w:ascii="Calibri" w:hAnsi="Calibri" w:eastAsia="Arial Unicode MS"/>
+                <w:b w:val="0"/>
+                <w:color w:val="111827"/>
+                <w:sz w:val="16"/>
+              </w:rPr>
+              <w:t>未识别</w:t>
+            </w:r>
+          </w:p>
+        </w:tc>
+        <w:tc>
+          <w:tcPr>
+            <w:tcW w:type="dxa" w:w="1680"/>
+            <w:vAlign w:val="center"/>
+          </w:tcPr>
+          <w:p>
+            <w:pPr>
+              <w:spacing w:before="0" w:after="0"/>
+            </w:pPr>
+            <w:r/>
+            <w:r>
+              <w:rPr>
+                <w:rFonts w:ascii="Calibri" w:hAnsi="Calibri" w:eastAsia="Arial Unicode MS"/>
+                <w:b w:val="0"/>
+                <w:color w:val="111827"/>
+                <w:sz w:val="16"/>
+              </w:rPr>
+              <w:t>宏观通胀传导</w:t>
+            </w:r>
+          </w:p>
+        </w:tc>
+        <w:tc>
+          <w:tcPr>
+            <w:tcW w:type="dxa" w:w="900"/>
+            <w:vAlign w:val="center"/>
+          </w:tcPr>
+          <w:p>
+            <w:pPr>
+              <w:spacing w:before="0" w:after="0"/>
+              <w:jc w:val="center"/>
+            </w:pPr>
+            <w:r/>
+            <w:r>
+              <w:rPr>
+                <w:rFonts w:ascii="Calibri" w:hAnsi="Calibri" w:eastAsia="Arial Unicode MS"/>
+                <w:b/>
+                <w:color w:val="111827"/>
+                <w:sz w:val="17"/>
+              </w:rPr>
+              <w:t>45.3</w:t>
+            </w:r>
+          </w:p>
+        </w:tc>
+        <w:tc>
+          <w:tcPr>
+            <w:tcW w:type="dxa" w:w="1500"/>
+            <w:vAlign w:val="center"/>
+          </w:tcPr>
+          <w:p>
+            <w:pPr>
+              <w:spacing w:before="0" w:after="0"/>
+              <w:jc w:val="center"/>
+            </w:pPr>
+            <w:r/>
+            <w:r>
+              <w:rPr>
+                <w:rFonts w:ascii="Calibri" w:hAnsi="Calibri" w:eastAsia="Arial Unicode MS"/>
+                <w:b w:val="0"/>
+                <w:color w:val="111827"/>
+                <w:sz w:val="16"/>
+              </w:rPr>
+              <w:t>风险 1</w:t>
+            </w:r>
+          </w:p>
+        </w:tc>
+      </w:tr>
+      <w:tr>
+        <w:tc>
+          <w:tcPr>
+            <w:tcW w:type="dxa" w:w="3720"/>
+            <w:vAlign w:val="center"/>
+          </w:tcPr>
+          <w:p>
+            <w:pPr>
+              <w:spacing w:before="0" w:after="0"/>
+            </w:pPr>
+            <w:r/>
+            <w:r>
+              <w:rPr>
+                <w:rFonts w:ascii="Calibri" w:hAnsi="Calibri" w:eastAsia="Arial Unicode MS"/>
+                <w:b w:val="0"/>
+                <w:color w:val="111827"/>
+                <w:sz w:val="17"/>
+              </w:rPr>
+              <w:t>公用事业分析工作日期 2026-07-20</w:t>
+            </w:r>
+          </w:p>
+        </w:tc>
+        <w:tc>
+          <w:tcPr>
+            <w:tcW w:type="dxa" w:w="1560"/>
+            <w:vAlign w:val="center"/>
+          </w:tcPr>
+          <w:p>
+            <w:pPr>
+              <w:spacing w:before="0" w:after="0"/>
+            </w:pPr>
+            <w:r/>
+            <w:r>
+              <w:rPr>
+                <w:rFonts w:ascii="Calibri" w:hAnsi="Calibri" w:eastAsia="Arial Unicode MS"/>
+                <w:b w:val="0"/>
+                <w:color w:val="111827"/>
+                <w:sz w:val="16"/>
+              </w:rPr>
+              <w:t>未识别</w:t>
+            </w:r>
+          </w:p>
+        </w:tc>
+        <w:tc>
+          <w:tcPr>
+            <w:tcW w:type="dxa" w:w="1680"/>
+            <w:vAlign w:val="center"/>
+          </w:tcPr>
+          <w:p>
+            <w:pPr>
+              <w:spacing w:before="0" w:after="0"/>
+            </w:pPr>
+            <w:r/>
+            <w:r>
+              <w:rPr>
+                <w:rFonts w:ascii="Calibri" w:hAnsi="Calibri" w:eastAsia="Arial Unicode MS"/>
+                <w:b w:val="0"/>
+                <w:color w:val="111827"/>
+                <w:sz w:val="16"/>
+              </w:rPr>
+              <w:t>电力与电网</w:t>
+            </w:r>
+          </w:p>
+        </w:tc>
+        <w:tc>
+          <w:tcPr>
+            <w:tcW w:type="dxa" w:w="900"/>
+            <w:vAlign w:val="center"/>
+          </w:tcPr>
+          <w:p>
+            <w:pPr>
+              <w:spacing w:before="0" w:after="0"/>
+              <w:jc w:val="center"/>
+            </w:pPr>
+            <w:r/>
+            <w:r>
+              <w:rPr>
+                <w:rFonts w:ascii="Calibri" w:hAnsi="Calibri" w:eastAsia="Arial Unicode MS"/>
+                <w:b/>
+                <w:color w:val="111827"/>
+                <w:sz w:val="17"/>
+              </w:rPr>
+              <w:t>45.2</w:t>
+            </w:r>
+          </w:p>
+        </w:tc>
+        <w:tc>
+          <w:tcPr>
+            <w:tcW w:type="dxa" w:w="1500"/>
+            <w:vAlign w:val="center"/>
+          </w:tcPr>
+          <w:p>
+            <w:pPr>
+              <w:spacing w:before="0" w:after="0"/>
+              <w:jc w:val="center"/>
+            </w:pPr>
+            <w:r/>
+            <w:r>
+              <w:rPr>
+                <w:rFonts w:ascii="Calibri" w:hAnsi="Calibri" w:eastAsia="Arial Unicode MS"/>
+                <w:b w:val="0"/>
+                <w:color w:val="111827"/>
+                <w:sz w:val="16"/>
+              </w:rPr>
+              <w:t>常规</w:t>
+            </w:r>
+          </w:p>
+        </w:tc>
+      </w:tr>
+      <w:tr>
+        <w:tc>
+          <w:tcPr>
+            <w:tcW w:type="dxa" w:w="3720"/>
+            <w:vAlign w:val="center"/>
+          </w:tcPr>
+          <w:p>
+            <w:pPr>
+              <w:spacing w:before="0" w:after="0"/>
+            </w:pPr>
+            <w:r/>
+            <w:r>
+              <w:rPr>
+                <w:rFonts w:ascii="Calibri" w:hAnsi="Calibri" w:eastAsia="Arial Unicode MS"/>
+                <w:b w:val="0"/>
+                <w:color w:val="111827"/>
+                <w:sz w:val="17"/>
+              </w:rPr>
+              <w:t>2026-07-20 半导体研究记录 02：先进封装良率压力、国内 Fab 毛利率与设备验证速度</w:t>
+            </w:r>
+          </w:p>
+        </w:tc>
+        <w:tc>
+          <w:tcPr>
+            <w:tcW w:type="dxa" w:w="1560"/>
+            <w:vAlign w:val="center"/>
+          </w:tcPr>
+          <w:p>
+            <w:pPr>
+              <w:spacing w:before="0" w:after="0"/>
+            </w:pPr>
+            <w:r/>
+            <w:r>
+              <w:rPr>
+                <w:rFonts w:ascii="Calibri" w:hAnsi="Calibri" w:eastAsia="Arial Unicode MS"/>
+                <w:b w:val="0"/>
+                <w:color w:val="111827"/>
+                <w:sz w:val="16"/>
+              </w:rPr>
+              <w:t>未识别</w:t>
+            </w:r>
+          </w:p>
+        </w:tc>
+        <w:tc>
+          <w:tcPr>
+            <w:tcW w:type="dxa" w:w="1680"/>
+            <w:vAlign w:val="center"/>
+          </w:tcPr>
+          <w:p>
+            <w:pPr>
+              <w:spacing w:before="0" w:after="0"/>
+            </w:pPr>
+            <w:r/>
+            <w:r>
+              <w:rPr>
+                <w:rFonts w:ascii="Calibri" w:hAnsi="Calibri" w:eastAsia="Arial Unicode MS"/>
+                <w:b w:val="0"/>
+                <w:color w:val="111827"/>
+                <w:sz w:val="16"/>
+              </w:rPr>
+              <w:t>半导体与存储</w:t>
+            </w:r>
+          </w:p>
+        </w:tc>
+        <w:tc>
+          <w:tcPr>
+            <w:tcW w:type="dxa" w:w="900"/>
+            <w:vAlign w:val="center"/>
+          </w:tcPr>
+          <w:p>
+            <w:pPr>
+              <w:spacing w:before="0" w:after="0"/>
+              <w:jc w:val="center"/>
+            </w:pPr>
+            <w:r/>
+            <w:r>
+              <w:rPr>
+                <w:rFonts w:ascii="Calibri" w:hAnsi="Calibri" w:eastAsia="Arial Unicode MS"/>
+                <w:b/>
+                <w:color w:val="111827"/>
+                <w:sz w:val="17"/>
+              </w:rPr>
+              <w:t>45.1</w:t>
+            </w:r>
+          </w:p>
+        </w:tc>
+        <w:tc>
+          <w:tcPr>
+            <w:tcW w:type="dxa" w:w="1500"/>
+            <w:vAlign w:val="center"/>
+          </w:tcPr>
+          <w:p>
+            <w:pPr>
+              <w:spacing w:before="0" w:after="0"/>
+              <w:jc w:val="center"/>
+            </w:pPr>
+            <w:r/>
+            <w:r>
+              <w:rPr>
+                <w:rFonts w:ascii="Calibri" w:hAnsi="Calibri" w:eastAsia="Arial Unicode MS"/>
+                <w:b w:val="0"/>
+                <w:color w:val="111827"/>
+                <w:sz w:val="16"/>
+              </w:rPr>
+              <w:t>风险 1</w:t>
+            </w:r>
+          </w:p>
+        </w:tc>
+      </w:tr>
+      <w:tr>
+        <w:tc>
+          <w:tcPr>
+            <w:tcW w:type="dxa" w:w="3720"/>
+            <w:vAlign w:val="center"/>
+          </w:tcPr>
+          <w:p>
+            <w:pPr>
+              <w:spacing w:before="0" w:after="0"/>
+            </w:pPr>
+            <w:r/>
+            <w:r>
+              <w:rPr>
+                <w:rFonts w:ascii="Calibri" w:hAnsi="Calibri" w:eastAsia="Arial Unicode MS"/>
+                <w:b w:val="0"/>
+                <w:color w:val="111827"/>
+                <w:sz w:val="17"/>
+              </w:rPr>
+              <w:t>A股市场结构压力测试：AI电力交付重配下的流动性与交易拥挤约束</w:t>
+            </w:r>
+          </w:p>
+        </w:tc>
+        <w:tc>
+          <w:tcPr>
+            <w:tcW w:type="dxa" w:w="1560"/>
+            <w:vAlign w:val="center"/>
+          </w:tcPr>
+          <w:p>
+            <w:pPr>
+              <w:spacing w:before="0" w:after="0"/>
+            </w:pPr>
+            <w:r/>
+            <w:r>
+              <w:rPr>
+                <w:rFonts w:ascii="Calibri" w:hAnsi="Calibri" w:eastAsia="Arial Unicode MS"/>
+                <w:b w:val="0"/>
+                <w:color w:val="111827"/>
+                <w:sz w:val="16"/>
+              </w:rPr>
+              <w:t>未识别</w:t>
+            </w:r>
+          </w:p>
+        </w:tc>
+        <w:tc>
+          <w:tcPr>
+            <w:tcW w:type="dxa" w:w="1680"/>
+            <w:vAlign w:val="center"/>
+          </w:tcPr>
+          <w:p>
+            <w:pPr>
+              <w:spacing w:before="0" w:after="0"/>
+            </w:pPr>
+            <w:r/>
+            <w:r>
+              <w:rPr>
+                <w:rFonts w:ascii="Calibri" w:hAnsi="Calibri" w:eastAsia="Arial Unicode MS"/>
+                <w:b w:val="0"/>
+                <w:color w:val="111827"/>
+                <w:sz w:val="16"/>
+              </w:rPr>
+              <w:t>宏观通胀传导</w:t>
+            </w:r>
+          </w:p>
+        </w:tc>
+        <w:tc>
+          <w:tcPr>
+            <w:tcW w:type="dxa" w:w="900"/>
+            <w:vAlign w:val="center"/>
+          </w:tcPr>
+          <w:p>
+            <w:pPr>
+              <w:spacing w:before="0" w:after="0"/>
+              <w:jc w:val="center"/>
+            </w:pPr>
+            <w:r/>
+            <w:r>
+              <w:rPr>
+                <w:rFonts w:ascii="Calibri" w:hAnsi="Calibri" w:eastAsia="Arial Unicode MS"/>
+                <w:b/>
+                <w:color w:val="111827"/>
+                <w:sz w:val="17"/>
+              </w:rPr>
+              <w:t>44.8</w:t>
+            </w:r>
+          </w:p>
+        </w:tc>
+        <w:tc>
+          <w:tcPr>
+            <w:tcW w:type="dxa" w:w="1500"/>
+            <w:vAlign w:val="center"/>
+          </w:tcPr>
+          <w:p>
+            <w:pPr>
+              <w:spacing w:before="0" w:after="0"/>
+              <w:jc w:val="center"/>
+            </w:pPr>
+            <w:r/>
+            <w:r>
+              <w:rPr>
+                <w:rFonts w:ascii="Calibri" w:hAnsi="Calibri" w:eastAsia="Arial Unicode MS"/>
+                <w:b w:val="0"/>
+                <w:color w:val="111827"/>
+                <w:sz w:val="16"/>
+              </w:rPr>
+              <w:t>风险 2</w:t>
+            </w:r>
+          </w:p>
+        </w:tc>
+      </w:tr>
+      <w:tr>
+        <w:tc>
+          <w:tcPr>
+            <w:tcW w:type="dxa" w:w="3720"/>
+            <w:vAlign w:val="center"/>
+          </w:tcPr>
+          <w:p>
+            <w:pPr>
+              <w:spacing w:before="0" w:after="0"/>
+            </w:pPr>
+            <w:r/>
+            <w:r>
+              <w:rPr>
+                <w:rFonts w:ascii="Calibri" w:hAnsi="Calibri" w:eastAsia="Arial Unicode MS"/>
+                <w:b w:val="0"/>
+                <w:color w:val="111827"/>
+                <w:sz w:val="17"/>
+              </w:rPr>
               <w:t>2026-07-20 压力测试：PJM 数据中心容量成本、零售传导与大负荷电价机制</w:t>
             </w:r>
           </w:p>
@@ -1976,334 +3284,7 @@
                 <w:color w:val="111827"/>
                 <w:sz w:val="17"/>
               </w:rPr>
-              <w:t>2026年7月20日 — 压力测试：电力缺口能否支撑超大规模厂商扩容？电网重定价是否真的削弱了公用事...</w:t>
-            </w:r>
-          </w:p>
-        </w:tc>
-        <w:tc>
-          <w:tcPr>
-            <w:tcW w:type="dxa" w:w="1560"/>
-            <w:vAlign w:val="center"/>
-          </w:tcPr>
-          <w:p>
-            <w:pPr>
-              <w:spacing w:before="0" w:after="0"/>
-            </w:pPr>
-            <w:r/>
-            <w:r>
-              <w:rPr>
-                <w:rFonts w:ascii="Calibri" w:hAnsi="Calibri" w:eastAsia="Arial Unicode MS"/>
-                <w:b w:val="0"/>
-                <w:color w:val="111827"/>
-                <w:sz w:val="16"/>
-              </w:rPr>
-              <w:t>未识别</w:t>
-            </w:r>
-          </w:p>
-        </w:tc>
-        <w:tc>
-          <w:tcPr>
-            <w:tcW w:type="dxa" w:w="1680"/>
-            <w:vAlign w:val="center"/>
-          </w:tcPr>
-          <w:p>
-            <w:pPr>
-              <w:spacing w:before="0" w:after="0"/>
-            </w:pPr>
-            <w:r/>
-            <w:r>
-              <w:rPr>
-                <w:rFonts w:ascii="Calibri" w:hAnsi="Calibri" w:eastAsia="Arial Unicode MS"/>
-                <w:b w:val="0"/>
-                <w:color w:val="111827"/>
-                <w:sz w:val="16"/>
-              </w:rPr>
-              <w:t>电力与电网</w:t>
-            </w:r>
-          </w:p>
-        </w:tc>
-        <w:tc>
-          <w:tcPr>
-            <w:tcW w:type="dxa" w:w="900"/>
-            <w:vAlign w:val="center"/>
-          </w:tcPr>
-          <w:p>
-            <w:pPr>
-              <w:spacing w:before="0" w:after="0"/>
-              <w:jc w:val="center"/>
-            </w:pPr>
-            <w:r/>
-            <w:r>
-              <w:rPr>
-                <w:rFonts w:ascii="Calibri" w:hAnsi="Calibri" w:eastAsia="Arial Unicode MS"/>
-                <w:b/>
-                <w:color w:val="111827"/>
-                <w:sz w:val="17"/>
-              </w:rPr>
-              <w:t>43.4</w:t>
-            </w:r>
-          </w:p>
-        </w:tc>
-        <w:tc>
-          <w:tcPr>
-            <w:tcW w:type="dxa" w:w="1500"/>
-            <w:vAlign w:val="center"/>
-          </w:tcPr>
-          <w:p>
-            <w:pPr>
-              <w:spacing w:before="0" w:after="0"/>
-              <w:jc w:val="center"/>
-            </w:pPr>
-            <w:r/>
-            <w:r>
-              <w:rPr>
-                <w:rFonts w:ascii="Calibri" w:hAnsi="Calibri" w:eastAsia="Arial Unicode MS"/>
-                <w:b w:val="0"/>
-                <w:color w:val="111827"/>
-                <w:sz w:val="16"/>
-              </w:rPr>
-              <w:t>风险 1</w:t>
-            </w:r>
-          </w:p>
-        </w:tc>
-      </w:tr>
-      <w:tr>
-        <w:tc>
-          <w:tcPr>
-            <w:tcW w:type="dxa" w:w="3720"/>
-            <w:vAlign w:val="center"/>
-          </w:tcPr>
-          <w:p>
-            <w:pPr>
-              <w:spacing w:before="0" w:after="0"/>
-            </w:pPr>
-            <w:r/>
-            <w:r>
-              <w:rPr>
-                <w:rFonts w:ascii="Calibri" w:hAnsi="Calibri" w:eastAsia="Arial Unicode MS"/>
-                <w:b w:val="0"/>
-                <w:color w:val="111827"/>
-                <w:sz w:val="17"/>
-              </w:rPr>
-              <w:t>2026-07-20 压力测试：AI 数据中心滑期、美国固定投资与 CPI 能源服务</w:t>
-            </w:r>
-          </w:p>
-        </w:tc>
-        <w:tc>
-          <w:tcPr>
-            <w:tcW w:type="dxa" w:w="1560"/>
-            <w:vAlign w:val="center"/>
-          </w:tcPr>
-          <w:p>
-            <w:pPr>
-              <w:spacing w:before="0" w:after="0"/>
-            </w:pPr>
-            <w:r/>
-            <w:r>
-              <w:rPr>
-                <w:rFonts w:ascii="Calibri" w:hAnsi="Calibri" w:eastAsia="Arial Unicode MS"/>
-                <w:b w:val="0"/>
-                <w:color w:val="111827"/>
-                <w:sz w:val="16"/>
-              </w:rPr>
-              <w:t>未识别</w:t>
-            </w:r>
-          </w:p>
-        </w:tc>
-        <w:tc>
-          <w:tcPr>
-            <w:tcW w:type="dxa" w:w="1680"/>
-            <w:vAlign w:val="center"/>
-          </w:tcPr>
-          <w:p>
-            <w:pPr>
-              <w:spacing w:before="0" w:after="0"/>
-            </w:pPr>
-            <w:r/>
-            <w:r>
-              <w:rPr>
-                <w:rFonts w:ascii="Calibri" w:hAnsi="Calibri" w:eastAsia="Arial Unicode MS"/>
-                <w:b w:val="0"/>
-                <w:color w:val="111827"/>
-                <w:sz w:val="16"/>
-              </w:rPr>
-              <w:t>宏观通胀传导</w:t>
-            </w:r>
-          </w:p>
-        </w:tc>
-        <w:tc>
-          <w:tcPr>
-            <w:tcW w:type="dxa" w:w="900"/>
-            <w:vAlign w:val="center"/>
-          </w:tcPr>
-          <w:p>
-            <w:pPr>
-              <w:spacing w:before="0" w:after="0"/>
-              <w:jc w:val="center"/>
-            </w:pPr>
-            <w:r/>
-            <w:r>
-              <w:rPr>
-                <w:rFonts w:ascii="Calibri" w:hAnsi="Calibri" w:eastAsia="Arial Unicode MS"/>
-                <w:b/>
-                <w:color w:val="111827"/>
-                <w:sz w:val="17"/>
-              </w:rPr>
-              <w:t>42.5</w:t>
-            </w:r>
-          </w:p>
-        </w:tc>
-        <w:tc>
-          <w:tcPr>
-            <w:tcW w:type="dxa" w:w="1500"/>
-            <w:vAlign w:val="center"/>
-          </w:tcPr>
-          <w:p>
-            <w:pPr>
-              <w:spacing w:before="0" w:after="0"/>
-              <w:jc w:val="center"/>
-            </w:pPr>
-            <w:r/>
-            <w:r>
-              <w:rPr>
-                <w:rFonts w:ascii="Calibri" w:hAnsi="Calibri" w:eastAsia="Arial Unicode MS"/>
-                <w:b w:val="0"/>
-                <w:color w:val="111827"/>
-                <w:sz w:val="16"/>
-              </w:rPr>
-              <w:t>风险 1</w:t>
-            </w:r>
-          </w:p>
-        </w:tc>
-      </w:tr>
-      <w:tr>
-        <w:tc>
-          <w:tcPr>
-            <w:tcW w:type="dxa" w:w="3720"/>
-            <w:vAlign w:val="center"/>
-          </w:tcPr>
-          <w:p>
-            <w:pPr>
-              <w:spacing w:before="0" w:after="0"/>
-            </w:pPr>
-            <w:r/>
-            <w:r>
-              <w:rPr>
-                <w:rFonts w:ascii="Calibri" w:hAnsi="Calibri" w:eastAsia="Arial Unicode MS"/>
-                <w:b w:val="0"/>
-                <w:color w:val="111827"/>
-                <w:sz w:val="17"/>
-              </w:rPr>
-              <w:t>半导体行业分析报告：去杠杆周期下国产替代产能验证、叠层良率挤压与组合压力测试</w:t>
-            </w:r>
-          </w:p>
-        </w:tc>
-        <w:tc>
-          <w:tcPr>
-            <w:tcW w:type="dxa" w:w="1560"/>
-            <w:vAlign w:val="center"/>
-          </w:tcPr>
-          <w:p>
-            <w:pPr>
-              <w:spacing w:before="0" w:after="0"/>
-            </w:pPr>
-            <w:r/>
-            <w:r>
-              <w:rPr>
-                <w:rFonts w:ascii="Calibri" w:hAnsi="Calibri" w:eastAsia="Arial Unicode MS"/>
-                <w:b w:val="0"/>
-                <w:color w:val="111827"/>
-                <w:sz w:val="16"/>
-              </w:rPr>
-              <w:t>未识别</w:t>
-            </w:r>
-          </w:p>
-        </w:tc>
-        <w:tc>
-          <w:tcPr>
-            <w:tcW w:type="dxa" w:w="1680"/>
-            <w:vAlign w:val="center"/>
-          </w:tcPr>
-          <w:p>
-            <w:pPr>
-              <w:spacing w:before="0" w:after="0"/>
-            </w:pPr>
-            <w:r/>
-            <w:r>
-              <w:rPr>
-                <w:rFonts w:ascii="Calibri" w:hAnsi="Calibri" w:eastAsia="Arial Unicode MS"/>
-                <w:b w:val="0"/>
-                <w:color w:val="111827"/>
-                <w:sz w:val="16"/>
-              </w:rPr>
-              <w:t>宏观通胀传导</w:t>
-            </w:r>
-          </w:p>
-        </w:tc>
-        <w:tc>
-          <w:tcPr>
-            <w:tcW w:type="dxa" w:w="900"/>
-            <w:vAlign w:val="center"/>
-          </w:tcPr>
-          <w:p>
-            <w:pPr>
-              <w:spacing w:before="0" w:after="0"/>
-              <w:jc w:val="center"/>
-            </w:pPr>
-            <w:r/>
-            <w:r>
-              <w:rPr>
-                <w:rFonts w:ascii="Calibri" w:hAnsi="Calibri" w:eastAsia="Arial Unicode MS"/>
-                <w:b/>
-                <w:color w:val="111827"/>
-                <w:sz w:val="17"/>
-              </w:rPr>
-              <w:t>42.4</w:t>
-            </w:r>
-          </w:p>
-        </w:tc>
-        <w:tc>
-          <w:tcPr>
-            <w:tcW w:type="dxa" w:w="1500"/>
-            <w:vAlign w:val="center"/>
-          </w:tcPr>
-          <w:p>
-            <w:pPr>
-              <w:spacing w:before="0" w:after="0"/>
-              <w:jc w:val="center"/>
-            </w:pPr>
-            <w:r/>
-            <w:r>
-              <w:rPr>
-                <w:rFonts w:ascii="Calibri" w:hAnsi="Calibri" w:eastAsia="Arial Unicode MS"/>
-                <w:b w:val="0"/>
-                <w:color w:val="111827"/>
-                <w:sz w:val="16"/>
-              </w:rPr>
-              <w:t>风险 1</w:t>
-            </w:r>
-          </w:p>
-        </w:tc>
-      </w:tr>
-      <w:tr>
-        <w:tc>
-          <w:tcPr>
-            <w:tcW w:type="dxa" w:w="3720"/>
-            <w:vAlign w:val="center"/>
-          </w:tcPr>
-          <w:p>
-            <w:pPr>
-              <w:spacing w:before="0" w:after="0"/>
-            </w:pPr>
-            <w:r/>
-            <w:r>
-              <w:rPr>
-                <w:rFonts w:ascii="Calibri" w:hAnsi="Calibri" w:eastAsia="Arial Unicode MS"/>
-                <w:b w:val="0"/>
-                <w:color w:val="111827"/>
-                <w:sz w:val="17"/>
-              </w:rPr>
-              <w:t>2026-07-20 策略报告：将数据中心电力合同信用折扣转化为跨资产仓位</w:t>
+              <w:t>research discussion Session Brief</w:t>
             </w:r>
           </w:p>
         </w:tc>
@@ -2367,988 +3348,7 @@
                 <w:color w:val="111827"/>
                 <w:sz w:val="17"/>
               </w:rPr>
-              <w:t>42.3</w:t>
-            </w:r>
-          </w:p>
-        </w:tc>
-        <w:tc>
-          <w:tcPr>
-            <w:tcW w:type="dxa" w:w="1500"/>
-            <w:vAlign w:val="center"/>
-          </w:tcPr>
-          <w:p>
-            <w:pPr>
-              <w:spacing w:before="0" w:after="0"/>
-              <w:jc w:val="center"/>
-            </w:pPr>
-            <w:r/>
-            <w:r>
-              <w:rPr>
-                <w:rFonts w:ascii="Calibri" w:hAnsi="Calibri" w:eastAsia="Arial Unicode MS"/>
-                <w:b w:val="0"/>
-                <w:color w:val="111827"/>
-                <w:sz w:val="16"/>
-              </w:rPr>
-              <w:t>风险 1</w:t>
-            </w:r>
-          </w:p>
-        </w:tc>
-      </w:tr>
-      <w:tr>
-        <w:tc>
-          <w:tcPr>
-            <w:tcW w:type="dxa" w:w="3720"/>
-            <w:vAlign w:val="center"/>
-          </w:tcPr>
-          <w:p>
-            <w:pPr>
-              <w:spacing w:before="0" w:after="0"/>
-            </w:pPr>
-            <w:r/>
-            <w:r>
-              <w:rPr>
-                <w:rFonts w:ascii="Calibri" w:hAnsi="Calibri" w:eastAsia="Arial Unicode MS"/>
-                <w:b w:val="0"/>
-                <w:color w:val="111827"/>
-                <w:sz w:val="17"/>
-              </w:rPr>
-              <w:t>能源压力测试：表后自建、地理外迁与容量市场租金捕获</w:t>
-            </w:r>
-          </w:p>
-        </w:tc>
-        <w:tc>
-          <w:tcPr>
-            <w:tcW w:type="dxa" w:w="1560"/>
-            <w:vAlign w:val="center"/>
-          </w:tcPr>
-          <w:p>
-            <w:pPr>
-              <w:spacing w:before="0" w:after="0"/>
-            </w:pPr>
-            <w:r/>
-            <w:r>
-              <w:rPr>
-                <w:rFonts w:ascii="Calibri" w:hAnsi="Calibri" w:eastAsia="Arial Unicode MS"/>
-                <w:b w:val="0"/>
-                <w:color w:val="111827"/>
-                <w:sz w:val="16"/>
-              </w:rPr>
-              <w:t>未识别</w:t>
-            </w:r>
-          </w:p>
-        </w:tc>
-        <w:tc>
-          <w:tcPr>
-            <w:tcW w:type="dxa" w:w="1680"/>
-            <w:vAlign w:val="center"/>
-          </w:tcPr>
-          <w:p>
-            <w:pPr>
-              <w:spacing w:before="0" w:after="0"/>
-            </w:pPr>
-            <w:r/>
-            <w:r>
-              <w:rPr>
-                <w:rFonts w:ascii="Calibri" w:hAnsi="Calibri" w:eastAsia="Arial Unicode MS"/>
-                <w:b w:val="0"/>
-                <w:color w:val="111827"/>
-                <w:sz w:val="16"/>
-              </w:rPr>
-              <w:t>宏观通胀传导</w:t>
-            </w:r>
-          </w:p>
-        </w:tc>
-        <w:tc>
-          <w:tcPr>
-            <w:tcW w:type="dxa" w:w="900"/>
-            <w:vAlign w:val="center"/>
-          </w:tcPr>
-          <w:p>
-            <w:pPr>
-              <w:spacing w:before="0" w:after="0"/>
-              <w:jc w:val="center"/>
-            </w:pPr>
-            <w:r/>
-            <w:r>
-              <w:rPr>
-                <w:rFonts w:ascii="Calibri" w:hAnsi="Calibri" w:eastAsia="Arial Unicode MS"/>
-                <w:b/>
-                <w:color w:val="111827"/>
-                <w:sz w:val="17"/>
-              </w:rPr>
-              <w:t>42.2</w:t>
-            </w:r>
-          </w:p>
-        </w:tc>
-        <w:tc>
-          <w:tcPr>
-            <w:tcW w:type="dxa" w:w="1500"/>
-            <w:vAlign w:val="center"/>
-          </w:tcPr>
-          <w:p>
-            <w:pPr>
-              <w:spacing w:before="0" w:after="0"/>
-              <w:jc w:val="center"/>
-            </w:pPr>
-            <w:r/>
-            <w:r>
-              <w:rPr>
-                <w:rFonts w:ascii="Calibri" w:hAnsi="Calibri" w:eastAsia="Arial Unicode MS"/>
-                <w:b w:val="0"/>
-                <w:color w:val="111827"/>
-                <w:sz w:val="16"/>
-              </w:rPr>
-              <w:t>风险 2</w:t>
-            </w:r>
-          </w:p>
-        </w:tc>
-      </w:tr>
-      <w:tr>
-        <w:tc>
-          <w:tcPr>
-            <w:tcW w:type="dxa" w:w="3720"/>
-            <w:vAlign w:val="center"/>
-          </w:tcPr>
-          <w:p>
-            <w:pPr>
-              <w:spacing w:before="0" w:after="0"/>
-            </w:pPr>
-            <w:r/>
-            <w:r>
-              <w:rPr>
-                <w:rFonts w:ascii="Calibri" w:hAnsi="Calibri" w:eastAsia="Arial Unicode MS"/>
-                <w:b w:val="0"/>
-                <w:color w:val="111827"/>
-                <w:sz w:val="17"/>
-              </w:rPr>
-              <w:t>压力测试：FERC 的大负荷成本归因规则能否补上州级零售费率缺口？</w:t>
-            </w:r>
-          </w:p>
-        </w:tc>
-        <w:tc>
-          <w:tcPr>
-            <w:tcW w:type="dxa" w:w="1560"/>
-            <w:vAlign w:val="center"/>
-          </w:tcPr>
-          <w:p>
-            <w:pPr>
-              <w:spacing w:before="0" w:after="0"/>
-            </w:pPr>
-            <w:r/>
-            <w:r>
-              <w:rPr>
-                <w:rFonts w:ascii="Calibri" w:hAnsi="Calibri" w:eastAsia="Arial Unicode MS"/>
-                <w:b w:val="0"/>
-                <w:color w:val="111827"/>
-                <w:sz w:val="16"/>
-              </w:rPr>
-              <w:t>未识别</w:t>
-            </w:r>
-          </w:p>
-        </w:tc>
-        <w:tc>
-          <w:tcPr>
-            <w:tcW w:type="dxa" w:w="1680"/>
-            <w:vAlign w:val="center"/>
-          </w:tcPr>
-          <w:p>
-            <w:pPr>
-              <w:spacing w:before="0" w:after="0"/>
-            </w:pPr>
-            <w:r/>
-            <w:r>
-              <w:rPr>
-                <w:rFonts w:ascii="Calibri" w:hAnsi="Calibri" w:eastAsia="Arial Unicode MS"/>
-                <w:b w:val="0"/>
-                <w:color w:val="111827"/>
-                <w:sz w:val="16"/>
-              </w:rPr>
-              <w:t>宏观通胀传导</w:t>
-            </w:r>
-          </w:p>
-        </w:tc>
-        <w:tc>
-          <w:tcPr>
-            <w:tcW w:type="dxa" w:w="900"/>
-            <w:vAlign w:val="center"/>
-          </w:tcPr>
-          <w:p>
-            <w:pPr>
-              <w:spacing w:before="0" w:after="0"/>
-              <w:jc w:val="center"/>
-            </w:pPr>
-            <w:r/>
-            <w:r>
-              <w:rPr>
-                <w:rFonts w:ascii="Calibri" w:hAnsi="Calibri" w:eastAsia="Arial Unicode MS"/>
-                <w:b/>
-                <w:color w:val="111827"/>
-                <w:sz w:val="17"/>
-              </w:rPr>
-              <w:t>41.7</w:t>
-            </w:r>
-          </w:p>
-        </w:tc>
-        <w:tc>
-          <w:tcPr>
-            <w:tcW w:type="dxa" w:w="1500"/>
-            <w:vAlign w:val="center"/>
-          </w:tcPr>
-          <w:p>
-            <w:pPr>
-              <w:spacing w:before="0" w:after="0"/>
-              <w:jc w:val="center"/>
-            </w:pPr>
-            <w:r/>
-            <w:r>
-              <w:rPr>
-                <w:rFonts w:ascii="Calibri" w:hAnsi="Calibri" w:eastAsia="Arial Unicode MS"/>
-                <w:b w:val="0"/>
-                <w:color w:val="111827"/>
-                <w:sz w:val="16"/>
-              </w:rPr>
-              <w:t>风险 2</w:t>
-            </w:r>
-          </w:p>
-        </w:tc>
-      </w:tr>
-      <w:tr>
-        <w:tc>
-          <w:tcPr>
-            <w:tcW w:type="dxa" w:w="3720"/>
-            <w:vAlign w:val="center"/>
-          </w:tcPr>
-          <w:p>
-            <w:pPr>
-              <w:spacing w:before="0" w:after="0"/>
-            </w:pPr>
-            <w:r/>
-            <w:r>
-              <w:rPr>
-                <w:rFonts w:ascii="Calibri" w:hAnsi="Calibri" w:eastAsia="Arial Unicode MS"/>
-                <w:b w:val="0"/>
-                <w:color w:val="111827"/>
-                <w:sz w:val="17"/>
-              </w:rPr>
-              <w:t>并不存在的进口能源传导：中国油品账单在下降、人民币在升值、政策偏向宽松</w:t>
-            </w:r>
-          </w:p>
-        </w:tc>
-        <w:tc>
-          <w:tcPr>
-            <w:tcW w:type="dxa" w:w="1560"/>
-            <w:vAlign w:val="center"/>
-          </w:tcPr>
-          <w:p>
-            <w:pPr>
-              <w:spacing w:before="0" w:after="0"/>
-            </w:pPr>
-            <w:r/>
-            <w:r>
-              <w:rPr>
-                <w:rFonts w:ascii="Calibri" w:hAnsi="Calibri" w:eastAsia="Arial Unicode MS"/>
-                <w:b w:val="0"/>
-                <w:color w:val="111827"/>
-                <w:sz w:val="16"/>
-              </w:rPr>
-              <w:t>未识别</w:t>
-            </w:r>
-          </w:p>
-        </w:tc>
-        <w:tc>
-          <w:tcPr>
-            <w:tcW w:type="dxa" w:w="1680"/>
-            <w:vAlign w:val="center"/>
-          </w:tcPr>
-          <w:p>
-            <w:pPr>
-              <w:spacing w:before="0" w:after="0"/>
-            </w:pPr>
-            <w:r/>
-            <w:r>
-              <w:rPr>
-                <w:rFonts w:ascii="Calibri" w:hAnsi="Calibri" w:eastAsia="Arial Unicode MS"/>
-                <w:b w:val="0"/>
-                <w:color w:val="111827"/>
-                <w:sz w:val="16"/>
-              </w:rPr>
-              <w:t>宏观通胀传导</w:t>
-            </w:r>
-          </w:p>
-        </w:tc>
-        <w:tc>
-          <w:tcPr>
-            <w:tcW w:type="dxa" w:w="900"/>
-            <w:vAlign w:val="center"/>
-          </w:tcPr>
-          <w:p>
-            <w:pPr>
-              <w:spacing w:before="0" w:after="0"/>
-              <w:jc w:val="center"/>
-            </w:pPr>
-            <w:r/>
-            <w:r>
-              <w:rPr>
-                <w:rFonts w:ascii="Calibri" w:hAnsi="Calibri" w:eastAsia="Arial Unicode MS"/>
-                <w:b/>
-                <w:color w:val="111827"/>
-                <w:sz w:val="17"/>
-              </w:rPr>
-              <w:t>41.0</w:t>
-            </w:r>
-          </w:p>
-        </w:tc>
-        <w:tc>
-          <w:tcPr>
-            <w:tcW w:type="dxa" w:w="1500"/>
-            <w:vAlign w:val="center"/>
-          </w:tcPr>
-          <w:p>
-            <w:pPr>
-              <w:spacing w:before="0" w:after="0"/>
-              <w:jc w:val="center"/>
-            </w:pPr>
-            <w:r/>
-            <w:r>
-              <w:rPr>
-                <w:rFonts w:ascii="Calibri" w:hAnsi="Calibri" w:eastAsia="Arial Unicode MS"/>
-                <w:b w:val="0"/>
-                <w:color w:val="111827"/>
-                <w:sz w:val="16"/>
-              </w:rPr>
-              <w:t>风险 1</w:t>
-            </w:r>
-          </w:p>
-        </w:tc>
-      </w:tr>
-      <w:tr>
-        <w:tc>
-          <w:tcPr>
-            <w:tcW w:type="dxa" w:w="3720"/>
-            <w:vAlign w:val="center"/>
-          </w:tcPr>
-          <w:p>
-            <w:pPr>
-              <w:spacing w:before="0" w:after="0"/>
-            </w:pPr>
-            <w:r/>
-            <w:r>
-              <w:rPr>
-                <w:rFonts w:ascii="Calibri" w:hAnsi="Calibri" w:eastAsia="Arial Unicode MS"/>
-                <w:b w:val="0"/>
-                <w:color w:val="111827"/>
-                <w:sz w:val="17"/>
-              </w:rPr>
-              <w:t>多资产配置重构与22%国债（CGB）汇率风险剥离对冲的执行方案</w:t>
-            </w:r>
-          </w:p>
-        </w:tc>
-        <w:tc>
-          <w:tcPr>
-            <w:tcW w:type="dxa" w:w="1560"/>
-            <w:vAlign w:val="center"/>
-          </w:tcPr>
-          <w:p>
-            <w:pPr>
-              <w:spacing w:before="0" w:after="0"/>
-            </w:pPr>
-            <w:r/>
-            <w:r>
-              <w:rPr>
-                <w:rFonts w:ascii="Calibri" w:hAnsi="Calibri" w:eastAsia="Arial Unicode MS"/>
-                <w:b w:val="0"/>
-                <w:color w:val="111827"/>
-                <w:sz w:val="16"/>
-              </w:rPr>
-              <w:t>未识别</w:t>
-            </w:r>
-          </w:p>
-        </w:tc>
-        <w:tc>
-          <w:tcPr>
-            <w:tcW w:type="dxa" w:w="1680"/>
-            <w:vAlign w:val="center"/>
-          </w:tcPr>
-          <w:p>
-            <w:pPr>
-              <w:spacing w:before="0" w:after="0"/>
-            </w:pPr>
-            <w:r/>
-            <w:r>
-              <w:rPr>
-                <w:rFonts w:ascii="Calibri" w:hAnsi="Calibri" w:eastAsia="Arial Unicode MS"/>
-                <w:b w:val="0"/>
-                <w:color w:val="111827"/>
-                <w:sz w:val="16"/>
-              </w:rPr>
-              <w:t>宏观通胀传导</w:t>
-            </w:r>
-          </w:p>
-        </w:tc>
-        <w:tc>
-          <w:tcPr>
-            <w:tcW w:type="dxa" w:w="900"/>
-            <w:vAlign w:val="center"/>
-          </w:tcPr>
-          <w:p>
-            <w:pPr>
-              <w:spacing w:before="0" w:after="0"/>
-              <w:jc w:val="center"/>
-            </w:pPr>
-            <w:r/>
-            <w:r>
-              <w:rPr>
-                <w:rFonts w:ascii="Calibri" w:hAnsi="Calibri" w:eastAsia="Arial Unicode MS"/>
-                <w:b/>
-                <w:color w:val="111827"/>
-                <w:sz w:val="17"/>
-              </w:rPr>
-              <w:t>41.0</w:t>
-            </w:r>
-          </w:p>
-        </w:tc>
-        <w:tc>
-          <w:tcPr>
-            <w:tcW w:type="dxa" w:w="1500"/>
-            <w:vAlign w:val="center"/>
-          </w:tcPr>
-          <w:p>
-            <w:pPr>
-              <w:spacing w:before="0" w:after="0"/>
-              <w:jc w:val="center"/>
-            </w:pPr>
-            <w:r/>
-            <w:r>
-              <w:rPr>
-                <w:rFonts w:ascii="Calibri" w:hAnsi="Calibri" w:eastAsia="Arial Unicode MS"/>
-                <w:b w:val="0"/>
-                <w:color w:val="111827"/>
-                <w:sz w:val="16"/>
-              </w:rPr>
-              <w:t>风险 1</w:t>
-            </w:r>
-          </w:p>
-        </w:tc>
-      </w:tr>
-      <w:tr>
-        <w:tc>
-          <w:tcPr>
-            <w:tcW w:type="dxa" w:w="3720"/>
-            <w:vAlign w:val="center"/>
-          </w:tcPr>
-          <w:p>
-            <w:pPr>
-              <w:spacing w:before="0" w:after="0"/>
-            </w:pPr>
-            <w:r/>
-            <w:r>
-              <w:rPr>
-                <w:rFonts w:ascii="Calibri" w:hAnsi="Calibri" w:eastAsia="Arial Unicode MS"/>
-                <w:b w:val="0"/>
-                <w:color w:val="111827"/>
-                <w:sz w:val="17"/>
-              </w:rPr>
-              <w:t>中国电动化改变的是能源路径，不是9月FOMC问题本身</w:t>
-            </w:r>
-          </w:p>
-        </w:tc>
-        <w:tc>
-          <w:tcPr>
-            <w:tcW w:type="dxa" w:w="1560"/>
-            <w:vAlign w:val="center"/>
-          </w:tcPr>
-          <w:p>
-            <w:pPr>
-              <w:spacing w:before="0" w:after="0"/>
-            </w:pPr>
-            <w:r/>
-            <w:r>
-              <w:rPr>
-                <w:rFonts w:ascii="Calibri" w:hAnsi="Calibri" w:eastAsia="Arial Unicode MS"/>
-                <w:b w:val="0"/>
-                <w:color w:val="111827"/>
-                <w:sz w:val="16"/>
-              </w:rPr>
-              <w:t>未识别</w:t>
-            </w:r>
-          </w:p>
-        </w:tc>
-        <w:tc>
-          <w:tcPr>
-            <w:tcW w:type="dxa" w:w="1680"/>
-            <w:vAlign w:val="center"/>
-          </w:tcPr>
-          <w:p>
-            <w:pPr>
-              <w:spacing w:before="0" w:after="0"/>
-            </w:pPr>
-            <w:r/>
-            <w:r>
-              <w:rPr>
-                <w:rFonts w:ascii="Calibri" w:hAnsi="Calibri" w:eastAsia="Arial Unicode MS"/>
-                <w:b w:val="0"/>
-                <w:color w:val="111827"/>
-                <w:sz w:val="16"/>
-              </w:rPr>
-              <w:t>宏观通胀传导</w:t>
-            </w:r>
-          </w:p>
-        </w:tc>
-        <w:tc>
-          <w:tcPr>
-            <w:tcW w:type="dxa" w:w="900"/>
-            <w:vAlign w:val="center"/>
-          </w:tcPr>
-          <w:p>
-            <w:pPr>
-              <w:spacing w:before="0" w:after="0"/>
-              <w:jc w:val="center"/>
-            </w:pPr>
-            <w:r/>
-            <w:r>
-              <w:rPr>
-                <w:rFonts w:ascii="Calibri" w:hAnsi="Calibri" w:eastAsia="Arial Unicode MS"/>
-                <w:b/>
-                <w:color w:val="111827"/>
-                <w:sz w:val="17"/>
-              </w:rPr>
-              <w:t>40.7</w:t>
-            </w:r>
-          </w:p>
-        </w:tc>
-        <w:tc>
-          <w:tcPr>
-            <w:tcW w:type="dxa" w:w="1500"/>
-            <w:vAlign w:val="center"/>
-          </w:tcPr>
-          <w:p>
-            <w:pPr>
-              <w:spacing w:before="0" w:after="0"/>
-              <w:jc w:val="center"/>
-            </w:pPr>
-            <w:r/>
-            <w:r>
-              <w:rPr>
-                <w:rFonts w:ascii="Calibri" w:hAnsi="Calibri" w:eastAsia="Arial Unicode MS"/>
-                <w:b w:val="0"/>
-                <w:color w:val="111827"/>
-                <w:sz w:val="16"/>
-              </w:rPr>
-              <w:t>风险 1</w:t>
-            </w:r>
-          </w:p>
-        </w:tc>
-      </w:tr>
-      <w:tr>
-        <w:tc>
-          <w:tcPr>
-            <w:tcW w:type="dxa" w:w="3720"/>
-            <w:vAlign w:val="center"/>
-          </w:tcPr>
-          <w:p>
-            <w:pPr>
-              <w:spacing w:before="0" w:after="0"/>
-            </w:pPr>
-            <w:r/>
-            <w:r>
-              <w:rPr>
-                <w:rFonts w:ascii="Calibri" w:hAnsi="Calibri" w:eastAsia="Arial Unicode MS"/>
-                <w:b w:val="0"/>
-                <w:color w:val="111827"/>
-                <w:sz w:val="17"/>
-              </w:rPr>
-              <w:t>既非缓冲亦非套息：人民币是一场正被官方主动刹车的逼空</w:t>
-            </w:r>
-          </w:p>
-        </w:tc>
-        <w:tc>
-          <w:tcPr>
-            <w:tcW w:type="dxa" w:w="1560"/>
-            <w:vAlign w:val="center"/>
-          </w:tcPr>
-          <w:p>
-            <w:pPr>
-              <w:spacing w:before="0" w:after="0"/>
-            </w:pPr>
-            <w:r/>
-            <w:r>
-              <w:rPr>
-                <w:rFonts w:ascii="Calibri" w:hAnsi="Calibri" w:eastAsia="Arial Unicode MS"/>
-                <w:b w:val="0"/>
-                <w:color w:val="111827"/>
-                <w:sz w:val="16"/>
-              </w:rPr>
-              <w:t>未识别</w:t>
-            </w:r>
-          </w:p>
-        </w:tc>
-        <w:tc>
-          <w:tcPr>
-            <w:tcW w:type="dxa" w:w="1680"/>
-            <w:vAlign w:val="center"/>
-          </w:tcPr>
-          <w:p>
-            <w:pPr>
-              <w:spacing w:before="0" w:after="0"/>
-            </w:pPr>
-            <w:r/>
-            <w:r>
-              <w:rPr>
-                <w:rFonts w:ascii="Calibri" w:hAnsi="Calibri" w:eastAsia="Arial Unicode MS"/>
-                <w:b w:val="0"/>
-                <w:color w:val="111827"/>
-                <w:sz w:val="16"/>
-              </w:rPr>
-              <w:t>AI 基础设施</w:t>
-            </w:r>
-          </w:p>
-        </w:tc>
-        <w:tc>
-          <w:tcPr>
-            <w:tcW w:type="dxa" w:w="900"/>
-            <w:vAlign w:val="center"/>
-          </w:tcPr>
-          <w:p>
-            <w:pPr>
-              <w:spacing w:before="0" w:after="0"/>
-              <w:jc w:val="center"/>
-            </w:pPr>
-            <w:r/>
-            <w:r>
-              <w:rPr>
-                <w:rFonts w:ascii="Calibri" w:hAnsi="Calibri" w:eastAsia="Arial Unicode MS"/>
-                <w:b/>
-                <w:color w:val="111827"/>
-                <w:sz w:val="17"/>
-              </w:rPr>
-              <w:t>40.4</w:t>
-            </w:r>
-          </w:p>
-        </w:tc>
-        <w:tc>
-          <w:tcPr>
-            <w:tcW w:type="dxa" w:w="1500"/>
-            <w:vAlign w:val="center"/>
-          </w:tcPr>
-          <w:p>
-            <w:pPr>
-              <w:spacing w:before="0" w:after="0"/>
-              <w:jc w:val="center"/>
-            </w:pPr>
-            <w:r/>
-            <w:r>
-              <w:rPr>
-                <w:rFonts w:ascii="Calibri" w:hAnsi="Calibri" w:eastAsia="Arial Unicode MS"/>
-                <w:b w:val="0"/>
-                <w:color w:val="111827"/>
-                <w:sz w:val="16"/>
-              </w:rPr>
-              <w:t>风险 2</w:t>
-            </w:r>
-          </w:p>
-        </w:tc>
-      </w:tr>
-      <w:tr>
-        <w:tc>
-          <w:tcPr>
-            <w:tcW w:type="dxa" w:w="3720"/>
-            <w:vAlign w:val="center"/>
-          </w:tcPr>
-          <w:p>
-            <w:pPr>
-              <w:spacing w:before="0" w:after="0"/>
-            </w:pPr>
-            <w:r/>
-            <w:r>
-              <w:rPr>
-                <w:rFonts w:ascii="Calibri" w:hAnsi="Calibri" w:eastAsia="Arial Unicode MS"/>
-                <w:b w:val="0"/>
-                <w:color w:val="111827"/>
-                <w:sz w:val="17"/>
-              </w:rPr>
-              <w:t>组合级收敛：当半导体与CPO坍缩为同一AI硬件因子后，真正低相关资产是什么</w:t>
-            </w:r>
-          </w:p>
-        </w:tc>
-        <w:tc>
-          <w:tcPr>
-            <w:tcW w:type="dxa" w:w="1560"/>
-            <w:vAlign w:val="center"/>
-          </w:tcPr>
-          <w:p>
-            <w:pPr>
-              <w:spacing w:before="0" w:after="0"/>
-            </w:pPr>
-            <w:r/>
-            <w:r>
-              <w:rPr>
-                <w:rFonts w:ascii="Calibri" w:hAnsi="Calibri" w:eastAsia="Arial Unicode MS"/>
-                <w:b w:val="0"/>
-                <w:color w:val="111827"/>
-                <w:sz w:val="16"/>
-              </w:rPr>
-              <w:t>未识别</w:t>
-            </w:r>
-          </w:p>
-        </w:tc>
-        <w:tc>
-          <w:tcPr>
-            <w:tcW w:type="dxa" w:w="1680"/>
-            <w:vAlign w:val="center"/>
-          </w:tcPr>
-          <w:p>
-            <w:pPr>
-              <w:spacing w:before="0" w:after="0"/>
-            </w:pPr>
-            <w:r/>
-            <w:r>
-              <w:rPr>
-                <w:rFonts w:ascii="Calibri" w:hAnsi="Calibri" w:eastAsia="Arial Unicode MS"/>
-                <w:b w:val="0"/>
-                <w:color w:val="111827"/>
-                <w:sz w:val="16"/>
-              </w:rPr>
-              <w:t>半导体与存储</w:t>
-            </w:r>
-          </w:p>
-        </w:tc>
-        <w:tc>
-          <w:tcPr>
-            <w:tcW w:type="dxa" w:w="900"/>
-            <w:vAlign w:val="center"/>
-          </w:tcPr>
-          <w:p>
-            <w:pPr>
-              <w:spacing w:before="0" w:after="0"/>
-              <w:jc w:val="center"/>
-            </w:pPr>
-            <w:r/>
-            <w:r>
-              <w:rPr>
-                <w:rFonts w:ascii="Calibri" w:hAnsi="Calibri" w:eastAsia="Arial Unicode MS"/>
-                <w:b/>
-                <w:color w:val="111827"/>
-                <w:sz w:val="17"/>
-              </w:rPr>
-              <w:t>39.9</w:t>
-            </w:r>
-          </w:p>
-        </w:tc>
-        <w:tc>
-          <w:tcPr>
-            <w:tcW w:type="dxa" w:w="1500"/>
-            <w:vAlign w:val="center"/>
-          </w:tcPr>
-          <w:p>
-            <w:pPr>
-              <w:spacing w:before="0" w:after="0"/>
-              <w:jc w:val="center"/>
-            </w:pPr>
-            <w:r/>
-            <w:r>
-              <w:rPr>
-                <w:rFonts w:ascii="Calibri" w:hAnsi="Calibri" w:eastAsia="Arial Unicode MS"/>
-                <w:b w:val="0"/>
-                <w:color w:val="111827"/>
-                <w:sz w:val="16"/>
-              </w:rPr>
-              <w:t>风险 1</w:t>
-            </w:r>
-          </w:p>
-        </w:tc>
-      </w:tr>
-      <w:tr>
-        <w:tc>
-          <w:tcPr>
-            <w:tcW w:type="dxa" w:w="3720"/>
-            <w:vAlign w:val="center"/>
-          </w:tcPr>
-          <w:p>
-            <w:pPr>
-              <w:spacing w:before="0" w:after="0"/>
-            </w:pPr>
-            <w:r/>
-            <w:r>
-              <w:rPr>
-                <w:rFonts w:ascii="Calibri" w:hAnsi="Calibri" w:eastAsia="Arial Unicode MS"/>
-                <w:b w:val="0"/>
-                <w:color w:val="111827"/>
-                <w:sz w:val="17"/>
-              </w:rPr>
-              <w:t>PJM容量价格剧烈波动下AI相关高级ABS的信用利差扩张与回收率压力测试</w:t>
-            </w:r>
-          </w:p>
-        </w:tc>
-        <w:tc>
-          <w:tcPr>
-            <w:tcW w:type="dxa" w:w="1560"/>
-            <w:vAlign w:val="center"/>
-          </w:tcPr>
-          <w:p>
-            <w:pPr>
-              <w:spacing w:before="0" w:after="0"/>
-            </w:pPr>
-            <w:r/>
-            <w:r>
-              <w:rPr>
-                <w:rFonts w:ascii="Calibri" w:hAnsi="Calibri" w:eastAsia="Arial Unicode MS"/>
-                <w:b w:val="0"/>
-                <w:color w:val="111827"/>
-                <w:sz w:val="16"/>
-              </w:rPr>
-              <w:t>未识别</w:t>
-            </w:r>
-          </w:p>
-        </w:tc>
-        <w:tc>
-          <w:tcPr>
-            <w:tcW w:type="dxa" w:w="1680"/>
-            <w:vAlign w:val="center"/>
-          </w:tcPr>
-          <w:p>
-            <w:pPr>
-              <w:spacing w:before="0" w:after="0"/>
-            </w:pPr>
-            <w:r/>
-            <w:r>
-              <w:rPr>
-                <w:rFonts w:ascii="Calibri" w:hAnsi="Calibri" w:eastAsia="Arial Unicode MS"/>
-                <w:b w:val="0"/>
-                <w:color w:val="111827"/>
-                <w:sz w:val="16"/>
-              </w:rPr>
-              <w:t>宏观通胀传导</w:t>
-            </w:r>
-          </w:p>
-        </w:tc>
-        <w:tc>
-          <w:tcPr>
-            <w:tcW w:type="dxa" w:w="900"/>
-            <w:vAlign w:val="center"/>
-          </w:tcPr>
-          <w:p>
-            <w:pPr>
-              <w:spacing w:before="0" w:after="0"/>
-              <w:jc w:val="center"/>
-            </w:pPr>
-            <w:r/>
-            <w:r>
-              <w:rPr>
-                <w:rFonts w:ascii="Calibri" w:hAnsi="Calibri" w:eastAsia="Arial Unicode MS"/>
-                <w:b/>
-                <w:color w:val="111827"/>
-                <w:sz w:val="17"/>
-              </w:rPr>
-              <w:t>39.9</w:t>
-            </w:r>
-          </w:p>
-        </w:tc>
-        <w:tc>
-          <w:tcPr>
-            <w:tcW w:type="dxa" w:w="1500"/>
-            <w:vAlign w:val="center"/>
-          </w:tcPr>
-          <w:p>
-            <w:pPr>
-              <w:spacing w:before="0" w:after="0"/>
-              <w:jc w:val="center"/>
-            </w:pPr>
-            <w:r/>
-            <w:r>
-              <w:rPr>
-                <w:rFonts w:ascii="Calibri" w:hAnsi="Calibri" w:eastAsia="Arial Unicode MS"/>
-                <w:b w:val="0"/>
-                <w:color w:val="111827"/>
-                <w:sz w:val="16"/>
-              </w:rPr>
-              <w:t>风险 1</w:t>
-            </w:r>
-          </w:p>
-        </w:tc>
-      </w:tr>
-      <w:tr>
-        <w:tc>
-          <w:tcPr>
-            <w:tcW w:type="dxa" w:w="3720"/>
-            <w:vAlign w:val="center"/>
-          </w:tcPr>
-          <w:p>
-            <w:pPr>
-              <w:spacing w:before="0" w:after="0"/>
-            </w:pPr>
-            <w:r/>
-            <w:r>
-              <w:rPr>
-                <w:rFonts w:ascii="Calibri" w:hAnsi="Calibri" w:eastAsia="Arial Unicode MS"/>
-                <w:b w:val="0"/>
-                <w:color w:val="111827"/>
-                <w:sz w:val="17"/>
-              </w:rPr>
-              <w:t>AI电力与算力资产的跨资产敞口重定尺：约束性合同缺口下的头寸规模与对冲结构</w:t>
-            </w:r>
-          </w:p>
-        </w:tc>
-        <w:tc>
-          <w:tcPr>
-            <w:tcW w:type="dxa" w:w="1560"/>
-            <w:vAlign w:val="center"/>
-          </w:tcPr>
-          <w:p>
-            <w:pPr>
-              <w:spacing w:before="0" w:after="0"/>
-            </w:pPr>
-            <w:r/>
-            <w:r>
-              <w:rPr>
-                <w:rFonts w:ascii="Calibri" w:hAnsi="Calibri" w:eastAsia="Arial Unicode MS"/>
-                <w:b w:val="0"/>
-                <w:color w:val="111827"/>
-                <w:sz w:val="16"/>
-              </w:rPr>
-              <w:t>未识别</w:t>
-            </w:r>
-          </w:p>
-        </w:tc>
-        <w:tc>
-          <w:tcPr>
-            <w:tcW w:type="dxa" w:w="1680"/>
-            <w:vAlign w:val="center"/>
-          </w:tcPr>
-          <w:p>
-            <w:pPr>
-              <w:spacing w:before="0" w:after="0"/>
-            </w:pPr>
-            <w:r/>
-            <w:r>
-              <w:rPr>
-                <w:rFonts w:ascii="Calibri" w:hAnsi="Calibri" w:eastAsia="Arial Unicode MS"/>
-                <w:b w:val="0"/>
-                <w:color w:val="111827"/>
-                <w:sz w:val="16"/>
-              </w:rPr>
-              <w:t>AI 基础设施</w:t>
-            </w:r>
-          </w:p>
-        </w:tc>
-        <w:tc>
-          <w:tcPr>
-            <w:tcW w:type="dxa" w:w="900"/>
-            <w:vAlign w:val="center"/>
-          </w:tcPr>
-          <w:p>
-            <w:pPr>
-              <w:spacing w:before="0" w:after="0"/>
-              <w:jc w:val="center"/>
-            </w:pPr>
-            <w:r/>
-            <w:r>
-              <w:rPr>
-                <w:rFonts w:ascii="Calibri" w:hAnsi="Calibri" w:eastAsia="Arial Unicode MS"/>
-                <w:b/>
-                <w:color w:val="111827"/>
-                <w:sz w:val="17"/>
-              </w:rPr>
-              <w:t>39.9</w:t>
+              <w:t>44.4</w:t>
             </w:r>
           </w:p>
         </w:tc>

</xml_diff>